<commit_message>
release: correct affine areas and figure semantics
</commit_message>
<xml_diff>
--- a/submission-jisrs/JISRS_Main_Manuscript_Anonymous.docx
+++ b/submission-jisrs/JISRS_Main_Manuscript_Anonymous.docx
@@ -6552,7 +6552,7 @@
           <w:rFonts w:ascii="Times New Roman" w:hAnsi="Times New Roman" w:eastAsia="Times New Roman"/>
           <w:sz w:val="24"/>
         </w:rPr>
-        <w:t xml:space="preserve">Valid-mask areas are 231.151 km</w:t>
+        <w:t xml:space="preserve">Affine valid-mask areas are 196.820 km</w:t>
       </w:r>
       <m:oMath>
         <m:sSup>
@@ -6601,7 +6601,7 @@
           <w:rFonts w:ascii="Times New Roman" w:hAnsi="Times New Roman" w:eastAsia="Times New Roman"/>
           <w:sz w:val="24"/>
         </w:rPr>
-        <w:t xml:space="preserve">and 350.338 km</w:t>
+        <w:t xml:space="preserve">and 267.435 km</w:t>
       </w:r>
       <m:oMath>
         <m:sSup>
@@ -6629,7 +6629,7 @@
           <w:rFonts w:ascii="Times New Roman" w:hAnsi="Times New Roman" w:eastAsia="Times New Roman"/>
           <w:sz w:val="24"/>
         </w:rPr>
-        <w:t xml:space="preserve">in Pish. TopoRadar-Net false-positive footprints are 87.82 ha (0.38 ha km</w:t>
+        <w:t xml:space="preserve">in Pish. TopoRadar-Net false-positive footprints are 74.77 ha (0.38 ha km</w:t>
       </w:r>
       <m:oMath>
         <m:sSup>
@@ -6656,7 +6656,7 @@
           <w:rFonts w:ascii="Times New Roman" w:hAnsi="Times New Roman" w:eastAsia="Times New Roman"/>
           <w:sz w:val="24"/>
         </w:rPr>
-        <w:t xml:space="preserve">) and 169.89 ha (0.48 ha km</w:t>
+        <w:t xml:space="preserve">) and 129.69 ha (0.48 ha km</w:t>
       </w:r>
       <m:oMath>
         <m:sSup>
@@ -6683,7 +6683,7 @@
           <w:rFonts w:ascii="Times New Roman" w:hAnsi="Times New Roman" w:eastAsia="Times New Roman"/>
           <w:sz w:val="24"/>
         </w:rPr>
-        <w:t xml:space="preserve">), respectively. Relative to the self-attention U-Net, this is a 30.0% reduction in Pish but a 28.5% increase in Troms</w:t>
+        <w:t xml:space="preserve">), respectively. Relative to the self-attention U-Net, this is a 30.0% reduction in Pish (129.69 versus 185.32 ha) but a 28.5% increase in Troms</w:t>
       </w:r>
       <w:r>
         <w:rPr>
@@ -6704,7 +6704,7 @@
           <w:rFonts w:ascii="Times New Roman" w:hAnsi="Times New Roman" w:eastAsia="Times New Roman"/>
           <w:sz w:val="24"/>
         </w:rPr>
-        <w:t xml:space="preserve">(87.82 versus 68.34 ha). Validation-calibrated road-corridor alerts achieve</w:t>
+        <w:t xml:space="preserve">(74.77 versus 58.19 ha). Validation-calibrated road-corridor alerts achieve</w:t>
       </w:r>
       <w:r>
         <w:rPr>

</xml_diff>

<commit_message>
release: repair Word caption and unit rendering
</commit_message>
<xml_diff>
--- a/submission-jisrs/JISRS_Main_Manuscript_Anonymous.docx
+++ b/submission-jisrs/JISRS_Main_Manuscript_Anonymous.docx
@@ -472,9 +472,17 @@
       <w:r>
         <w:rPr>
           <w:rFonts w:ascii="Times New Roman" w:hAnsi="Times New Roman" w:eastAsia="Times New Roman"/>
-          <w:sz w:val="24"/>
-        </w:rPr>
-        <w:t xml:space="preserve">AvalCD scenes used in the cross-region study. Debris is the number of labelled positive pixels</w:t>
+          <w:b/>
+          <w:sz w:val="24"/>
+        </w:rPr>
+        <w:t xml:space="preserve">Table 1. </w:t>
+      </w:r>
+      <w:r>
+        <w:rPr>
+          <w:rFonts w:ascii="Times New Roman" w:hAnsi="Times New Roman" w:eastAsia="Times New Roman"/>
+          <w:sz w:val="24"/>
+        </w:rPr>
+        <w:t>AvalCD scenes used in the cross-region study. Debris is the number of labelled positive pixels</w:t>
       </w:r>
     </w:p>
     <w:tbl>
@@ -2796,9 +2804,17 @@
       <w:r>
         <w:rPr>
           <w:rFonts w:ascii="Times New Roman" w:hAnsi="Times New Roman" w:eastAsia="Times New Roman"/>
-          <w:sz w:val="24"/>
-        </w:rPr>
-        <w:t xml:space="preserve">TopoRadar-Net schematic. Bitemporal SAR differences query pooled topographic keys and values; a pixelwise terrain gate conditions decoding. The training schematic omits the ground-truth loss input for clarity</w:t>
+          <w:b/>
+          <w:sz w:val="24"/>
+        </w:rPr>
+        <w:t xml:space="preserve">Fig. 1. </w:t>
+      </w:r>
+      <w:r>
+        <w:rPr>
+          <w:rFonts w:ascii="Times New Roman" w:hAnsi="Times New Roman" w:eastAsia="Times New Roman"/>
+          <w:sz w:val="24"/>
+        </w:rPr>
+        <w:t>TopoRadar-Net schematic. Bitemporal SAR differences query pooled topographic keys and values; a pixelwise terrain gate conditions decoding. The training schematic omits the ground-truth loss input for clarity</w:t>
       </w:r>
     </w:p>
     <w:bookmarkEnd w:id="15"/>
@@ -3792,70 +3808,17 @@
       <w:r>
         <w:rPr>
           <w:rFonts w:ascii="Times New Roman" w:hAnsi="Times New Roman" w:eastAsia="Times New Roman"/>
-          <w:sz w:val="24"/>
-        </w:rPr>
-        <w:t xml:space="preserve">Zero-shot test performance across three fixed training seeds (mean</w:t>
-      </w:r>
-      <w:r>
-        <w:rPr>
-          <w:rFonts w:ascii="Times New Roman" w:hAnsi="Times New Roman" w:eastAsia="Times New Roman"/>
-          <w:sz w:val="24"/>
-        </w:rPr>
-        <w:t xml:space="preserve"> </w:t>
-      </w:r>
-      <m:oMath>
-        <m:r>
-          <m:rPr>
-            <m:sty m:val="p"/>
-          </m:rPr>
-          <m:t>±</m:t>
-        </m:r>
-      </m:oMath>
-      <w:r>
-        <w:rPr>
-          <w:rFonts w:ascii="Times New Roman" w:hAnsi="Times New Roman" w:eastAsia="Times New Roman"/>
-          <w:sz w:val="24"/>
-        </w:rPr>
-        <w:t xml:space="preserve"> </w:t>
-      </w:r>
-      <w:r>
-        <w:rPr>
-          <w:rFonts w:ascii="Times New Roman" w:hAnsi="Times New Roman" w:eastAsia="Times New Roman"/>
-          <w:sz w:val="24"/>
-        </w:rPr>
-        <w:t xml:space="preserve">descriptive population standard deviation). HR is polygon hit rate at</w:t>
-      </w:r>
-      <w:r>
-        <w:rPr>
-          <w:rFonts w:ascii="Times New Roman" w:hAnsi="Times New Roman" w:eastAsia="Times New Roman"/>
-          <w:sz w:val="24"/>
-        </w:rPr>
-        <w:t xml:space="preserve"> </w:t>
-      </w:r>
-      <m:oMath>
-        <m:r>
-          <m:t>30</m:t>
-        </m:r>
-        <m:r>
-          <m:rPr>
-            <m:sty m:val="p"/>
-          </m:rPr>
-          <m:t>%</m:t>
-        </m:r>
-      </m:oMath>
-      <w:r>
-        <w:rPr>
-          <w:rFonts w:ascii="Times New Roman" w:hAnsi="Times New Roman" w:eastAsia="Times New Roman"/>
-          <w:sz w:val="24"/>
-        </w:rPr>
-        <w:t xml:space="preserve"> </w:t>
-      </w:r>
-      <w:r>
-        <w:rPr>
-          <w:rFonts w:ascii="Times New Roman" w:hAnsi="Times New Roman" w:eastAsia="Times New Roman"/>
-          <w:sz w:val="24"/>
-        </w:rPr>
-        <w:t xml:space="preserve">overlap</w:t>
+          <w:b/>
+          <w:sz w:val="24"/>
+        </w:rPr>
+        <w:t xml:space="preserve">Table 2. </w:t>
+      </w:r>
+      <w:r>
+        <w:rPr>
+          <w:rFonts w:ascii="Times New Roman" w:hAnsi="Times New Roman" w:eastAsia="Times New Roman"/>
+          <w:sz w:val="24"/>
+        </w:rPr>
+        <w:t>Zero-shot test performance across three fixed training seeds (mean  descriptive population standard deviation). HR is polygon hit rate at  overlap</w:t>
       </w:r>
     </w:p>
     <w:tbl>
@@ -4860,23 +4823,17 @@
       <w:r>
         <w:rPr>
           <w:rFonts w:ascii="Times New Roman" w:hAnsi="Times New Roman" w:eastAsia="Times New Roman"/>
-          <w:sz w:val="24"/>
-        </w:rPr>
-        <w:t xml:space="preserve">Zero-shot pixel F1 across held-out Troms</w:t>
-      </w:r>
-      <w:r>
-        <w:rPr>
-          <w:rFonts w:ascii="Times New Roman" w:hAnsi="Times New Roman" w:eastAsia="Times New Roman"/>
-          <w:sz w:val="24"/>
-        </w:rPr>
-        <w:t xml:space="preserve">ø</w:t>
-      </w:r>
-      <w:r>
-        <w:rPr>
-          <w:rFonts w:ascii="Times New Roman" w:hAnsi="Times New Roman" w:eastAsia="Times New Roman"/>
-          <w:sz w:val="24"/>
-        </w:rPr>
-        <w:t xml:space="preserve">, Pish, and their macro average. Error bars show descriptive population standard deviation over three fixed training seeds</w:t>
+          <w:b/>
+          <w:sz w:val="24"/>
+        </w:rPr>
+        <w:t xml:space="preserve">Fig. 2. </w:t>
+      </w:r>
+      <w:r>
+        <w:rPr>
+          <w:rFonts w:ascii="Times New Roman" w:hAnsi="Times New Roman" w:eastAsia="Times New Roman"/>
+          <w:sz w:val="24"/>
+        </w:rPr>
+        <w:t>Zero-shot pixel F1 across held-out Tromsø, Pish, and their macro average. Error bars show descriptive population standard deviation over three fixed training seeds</w:t>
       </w:r>
     </w:p>
     <w:bookmarkEnd w:id="24"/>
@@ -5357,9 +5314,17 @@
       <w:r>
         <w:rPr>
           <w:rFonts w:ascii="Times New Roman" w:hAnsi="Times New Roman" w:eastAsia="Times New Roman"/>
-          <w:sz w:val="24"/>
-        </w:rPr>
-        <w:t xml:space="preserve">Ablation performance across three seeds. The highest pooled value is obtained without aspect and its fixed-reference coordinate</w:t>
+          <w:b/>
+          <w:sz w:val="24"/>
+        </w:rPr>
+        <w:t xml:space="preserve">Table 3. </w:t>
+      </w:r>
+      <w:r>
+        <w:rPr>
+          <w:rFonts w:ascii="Times New Roman" w:hAnsi="Times New Roman" w:eastAsia="Times New Roman"/>
+          <w:sz w:val="24"/>
+        </w:rPr>
+        <w:t>Ablation performance across three seeds. The highest pooled value is obtained without aspect and its fixed-reference coordinate</w:t>
       </w:r>
     </w:p>
     <w:tbl>
@@ -6552,13 +6517,35 @@
           <w:rFonts w:ascii="Times New Roman" w:hAnsi="Times New Roman" w:eastAsia="Times New Roman"/>
           <w:sz w:val="24"/>
         </w:rPr>
-        <w:t xml:space="preserve">Affine valid-mask areas are 196.820 km</w:t>
+        <w:t xml:space="preserve">The affine valid-mask area is</w:t>
+      </w:r>
+      <w:r>
+        <w:rPr>
+          <w:rFonts w:ascii="Times New Roman" w:hAnsi="Times New Roman" w:eastAsia="Times New Roman"/>
+          <w:sz w:val="24"/>
+        </w:rPr>
+        <w:t xml:space="preserve"> </w:t>
       </w:r>
       <m:oMath>
+        <m:r>
+          <m:t>196.820</m:t>
+        </m:r>
+        <m:r>
+          <m:t> </m:t>
+        </m:r>
         <m:sSup>
           <m:e>
             <m:r>
-              <m:t>​</m:t>
+              <m:rPr>
+                <m:sty m:val="p"/>
+              </m:rPr>
+              <m:t>k</m:t>
+            </m:r>
+            <m:r>
+              <m:rPr>
+                <m:sty m:val="p"/>
+              </m:rPr>
+              <m:t>m</m:t>
             </m:r>
           </m:e>
           <m:sup>
@@ -6601,13 +6588,35 @@
           <w:rFonts w:ascii="Times New Roman" w:hAnsi="Times New Roman" w:eastAsia="Times New Roman"/>
           <w:sz w:val="24"/>
         </w:rPr>
-        <w:t xml:space="preserve">and 267.435 km</w:t>
+        <w:t xml:space="preserve">and</w:t>
+      </w:r>
+      <w:r>
+        <w:rPr>
+          <w:rFonts w:ascii="Times New Roman" w:hAnsi="Times New Roman" w:eastAsia="Times New Roman"/>
+          <w:sz w:val="24"/>
+        </w:rPr>
+        <w:t xml:space="preserve"> </w:t>
       </w:r>
       <m:oMath>
+        <m:r>
+          <m:t>267.435</m:t>
+        </m:r>
+        <m:r>
+          <m:t> </m:t>
+        </m:r>
         <m:sSup>
           <m:e>
             <m:r>
-              <m:t>​</m:t>
+              <m:rPr>
+                <m:sty m:val="p"/>
+              </m:rPr>
+              <m:t>k</m:t>
+            </m:r>
+            <m:r>
+              <m:rPr>
+                <m:sty m:val="p"/>
+              </m:rPr>
+              <m:t>m</m:t>
             </m:r>
           </m:e>
           <m:sup>
@@ -6629,13 +6638,93 @@
           <w:rFonts w:ascii="Times New Roman" w:hAnsi="Times New Roman" w:eastAsia="Times New Roman"/>
           <w:sz w:val="24"/>
         </w:rPr>
-        <w:t xml:space="preserve">in Pish. TopoRadar-Net false-positive footprints are 74.77 ha (0.38 ha km</w:t>
+        <w:t xml:space="preserve">in Pish. In Troms</w:t>
+      </w:r>
+      <w:r>
+        <w:rPr>
+          <w:rFonts w:ascii="Times New Roman" w:hAnsi="Times New Roman" w:eastAsia="Times New Roman"/>
+          <w:sz w:val="24"/>
+        </w:rPr>
+        <w:t xml:space="preserve">ø</w:t>
+      </w:r>
+      <w:r>
+        <w:rPr>
+          <w:rFonts w:ascii="Times New Roman" w:hAnsi="Times New Roman" w:eastAsia="Times New Roman"/>
+          <w:sz w:val="24"/>
+        </w:rPr>
+        <w:t xml:space="preserve">, TopoRadar-Net produces</w:t>
+      </w:r>
+      <w:r>
+        <w:rPr>
+          <w:rFonts w:ascii="Times New Roman" w:hAnsi="Times New Roman" w:eastAsia="Times New Roman"/>
+          <w:sz w:val="24"/>
+        </w:rPr>
+        <w:t xml:space="preserve"> </w:t>
       </w:r>
       <m:oMath>
+        <m:r>
+          <m:t>74.77</m:t>
+        </m:r>
+      </m:oMath>
+      <w:r>
+        <w:rPr>
+          <w:rFonts w:ascii="Times New Roman" w:hAnsi="Times New Roman" w:eastAsia="Times New Roman"/>
+          <w:sz w:val="24"/>
+        </w:rPr>
+        <w:t xml:space="preserve"> </w:t>
+      </w:r>
+      <w:r>
+        <w:rPr>
+          <w:rFonts w:ascii="Times New Roman" w:hAnsi="Times New Roman" w:eastAsia="Times New Roman"/>
+          <w:sz w:val="24"/>
+        </w:rPr>
+        <w:t xml:space="preserve">ha of false positives at</w:t>
+      </w:r>
+      <w:r>
+        <w:rPr>
+          <w:rFonts w:ascii="Times New Roman" w:hAnsi="Times New Roman" w:eastAsia="Times New Roman"/>
+          <w:sz w:val="24"/>
+        </w:rPr>
+        <w:t xml:space="preserve"> </w:t>
+      </w:r>
+      <m:oMath>
+        <m:r>
+          <m:t>0.38</m:t>
+        </m:r>
+        <m:r>
+          <m:t> </m:t>
+        </m:r>
         <m:sSup>
           <m:e>
             <m:r>
-              <m:t>​</m:t>
+              <m:rPr>
+                <m:sty m:val="p"/>
+              </m:rPr>
+              <m:t>h</m:t>
+            </m:r>
+            <m:r>
+              <m:rPr>
+                <m:sty m:val="p"/>
+              </m:rPr>
+              <m:t>a</m:t>
+            </m:r>
+            <m:r>
+              <m:rPr>
+                <m:sty m:val="p"/>
+              </m:rPr>
+              <m:t> </m:t>
+            </m:r>
+            <m:r>
+              <m:rPr>
+                <m:sty m:val="p"/>
+              </m:rPr>
+              <m:t>k</m:t>
+            </m:r>
+            <m:r>
+              <m:rPr>
+                <m:sty m:val="p"/>
+              </m:rPr>
+              <m:t>m</m:t>
             </m:r>
           </m:e>
           <m:sup>
@@ -6656,13 +6745,79 @@
           <w:rFonts w:ascii="Times New Roman" w:hAnsi="Times New Roman" w:eastAsia="Times New Roman"/>
           <w:sz w:val="24"/>
         </w:rPr>
-        <w:t xml:space="preserve">) and 129.69 ha (0.48 ha km</w:t>
+        <w:t xml:space="preserve">. In Pish, it produces</w:t>
+      </w:r>
+      <w:r>
+        <w:rPr>
+          <w:rFonts w:ascii="Times New Roman" w:hAnsi="Times New Roman" w:eastAsia="Times New Roman"/>
+          <w:sz w:val="24"/>
+        </w:rPr>
+        <w:t xml:space="preserve"> </w:t>
       </w:r>
       <m:oMath>
+        <m:r>
+          <m:t>129.69</m:t>
+        </m:r>
+      </m:oMath>
+      <w:r>
+        <w:rPr>
+          <w:rFonts w:ascii="Times New Roman" w:hAnsi="Times New Roman" w:eastAsia="Times New Roman"/>
+          <w:sz w:val="24"/>
+        </w:rPr>
+        <w:t xml:space="preserve"> </w:t>
+      </w:r>
+      <w:r>
+        <w:rPr>
+          <w:rFonts w:ascii="Times New Roman" w:hAnsi="Times New Roman" w:eastAsia="Times New Roman"/>
+          <w:sz w:val="24"/>
+        </w:rPr>
+        <w:t xml:space="preserve">ha at</w:t>
+      </w:r>
+      <w:r>
+        <w:rPr>
+          <w:rFonts w:ascii="Times New Roman" w:hAnsi="Times New Roman" w:eastAsia="Times New Roman"/>
+          <w:sz w:val="24"/>
+        </w:rPr>
+        <w:t xml:space="preserve"> </w:t>
+      </w:r>
+      <m:oMath>
+        <m:r>
+          <m:t>0.48</m:t>
+        </m:r>
+        <m:r>
+          <m:t> </m:t>
+        </m:r>
         <m:sSup>
           <m:e>
             <m:r>
-              <m:t>​</m:t>
+              <m:rPr>
+                <m:sty m:val="p"/>
+              </m:rPr>
+              <m:t>h</m:t>
+            </m:r>
+            <m:r>
+              <m:rPr>
+                <m:sty m:val="p"/>
+              </m:rPr>
+              <m:t>a</m:t>
+            </m:r>
+            <m:r>
+              <m:rPr>
+                <m:sty m:val="p"/>
+              </m:rPr>
+              <m:t> </m:t>
+            </m:r>
+            <m:r>
+              <m:rPr>
+                <m:sty m:val="p"/>
+              </m:rPr>
+              <m:t>k</m:t>
+            </m:r>
+            <m:r>
+              <m:rPr>
+                <m:sty m:val="p"/>
+              </m:rPr>
+              <m:t>m</m:t>
             </m:r>
           </m:e>
           <m:sup>
@@ -6683,7 +6838,7 @@
           <w:rFonts w:ascii="Times New Roman" w:hAnsi="Times New Roman" w:eastAsia="Times New Roman"/>
           <w:sz w:val="24"/>
         </w:rPr>
-        <w:t xml:space="preserve">), respectively. Relative to the self-attention U-Net, this is a 30.0% reduction in Pish (129.69 versus 185.32 ha) but a 28.5% increase in Troms</w:t>
+        <w:t xml:space="preserve">. Relative to the self-attention U-Net, this is a 30.0% reduction in Pish (129.69 versus 185.32 ha) but a 28.5% increase in Troms</w:t>
       </w:r>
       <w:r>
         <w:rPr>

</xml_diff>

<commit_message>
release: finalize JISRS editable Word typography
</commit_message>
<xml_diff>
--- a/submission-jisrs/JISRS_Main_Manuscript_Anonymous.docx
+++ b/submission-jisrs/JISRS_Main_Manuscript_Anonymous.docx
@@ -482,7 +482,7 @@
           <w:rFonts w:ascii="Times New Roman" w:hAnsi="Times New Roman" w:eastAsia="Times New Roman"/>
           <w:sz w:val="24"/>
         </w:rPr>
-        <w:t>AvalCD scenes used in the cross-region study. Debris is the number of labelled positive pixels</w:t>
+        <w:t xml:space="preserve">AvalCD scenes used in the cross-region study. Debris is the number of labelled positive pixels</w:t>
       </w:r>
     </w:p>
     <w:tbl>
@@ -2814,7 +2814,7 @@
           <w:rFonts w:ascii="Times New Roman" w:hAnsi="Times New Roman" w:eastAsia="Times New Roman"/>
           <w:sz w:val="24"/>
         </w:rPr>
-        <w:t>TopoRadar-Net schematic. Bitemporal SAR differences query pooled topographic keys and values; a pixelwise terrain gate conditions decoding. The training schematic omits the ground-truth loss input for clarity</w:t>
+        <w:t xml:space="preserve">TopoRadar-Net schematic. Bitemporal SAR differences query pooled topographic keys and values; a pixelwise terrain gate conditions decoding. The training schematic omits the ground-truth loss input for clarity</w:t>
       </w:r>
     </w:p>
     <w:bookmarkEnd w:id="15"/>
@@ -3818,7 +3818,68 @@
           <w:rFonts w:ascii="Times New Roman" w:hAnsi="Times New Roman" w:eastAsia="Times New Roman"/>
           <w:sz w:val="24"/>
         </w:rPr>
-        <w:t>Zero-shot test performance across three fixed training seeds (mean  descriptive population standard deviation). HR is polygon hit rate at  overlap</w:t>
+        <w:t xml:space="preserve">Zero-shot test performance across three fixed training seeds (mean</w:t>
+      </w:r>
+      <w:r>
+        <w:rPr>
+          <w:rFonts w:ascii="Times New Roman" w:hAnsi="Times New Roman" w:eastAsia="Times New Roman"/>
+          <w:sz w:val="24"/>
+        </w:rPr>
+        <w:t xml:space="preserve"> </w:t>
+      </w:r>
+      <m:oMath>
+        <m:r>
+          <m:rPr>
+            <m:sty m:val="p"/>
+          </m:rPr>
+          <m:t>±</m:t>
+        </m:r>
+      </m:oMath>
+      <w:r>
+        <w:rPr>
+          <w:rFonts w:ascii="Times New Roman" w:hAnsi="Times New Roman" w:eastAsia="Times New Roman"/>
+          <w:sz w:val="24"/>
+        </w:rPr>
+        <w:t xml:space="preserve"> </w:t>
+      </w:r>
+      <w:r>
+        <w:rPr>
+          <w:rFonts w:ascii="Times New Roman" w:hAnsi="Times New Roman" w:eastAsia="Times New Roman"/>
+          <w:sz w:val="24"/>
+        </w:rPr>
+        <w:t xml:space="preserve">descriptive population standard deviation). HR is polygon hit rate at</w:t>
+      </w:r>
+      <w:r>
+        <w:rPr>
+          <w:rFonts w:ascii="Times New Roman" w:hAnsi="Times New Roman" w:eastAsia="Times New Roman"/>
+          <w:sz w:val="24"/>
+        </w:rPr>
+        <w:t xml:space="preserve"> </w:t>
+      </w:r>
+      <m:oMath>
+        <m:r>
+          <m:t>30</m:t>
+        </m:r>
+        <m:r>
+          <m:rPr>
+            <m:sty m:val="p"/>
+          </m:rPr>
+          <m:t>%</m:t>
+        </m:r>
+      </m:oMath>
+      <w:r>
+        <w:rPr>
+          <w:rFonts w:ascii="Times New Roman" w:hAnsi="Times New Roman" w:eastAsia="Times New Roman"/>
+          <w:sz w:val="24"/>
+        </w:rPr>
+        <w:t xml:space="preserve"> </w:t>
+      </w:r>
+      <w:r>
+        <w:rPr>
+          <w:rFonts w:ascii="Times New Roman" w:hAnsi="Times New Roman" w:eastAsia="Times New Roman"/>
+          <w:sz w:val="24"/>
+        </w:rPr>
+        <w:t xml:space="preserve">overlap</w:t>
       </w:r>
     </w:p>
     <w:tbl>
@@ -4833,7 +4894,21 @@
           <w:rFonts w:ascii="Times New Roman" w:hAnsi="Times New Roman" w:eastAsia="Times New Roman"/>
           <w:sz w:val="24"/>
         </w:rPr>
-        <w:t>Zero-shot pixel F1 across held-out Tromsø, Pish, and their macro average. Error bars show descriptive population standard deviation over three fixed training seeds</w:t>
+        <w:t xml:space="preserve">Zero-shot pixel F1 across held-out Troms</w:t>
+      </w:r>
+      <w:r>
+        <w:rPr>
+          <w:rFonts w:ascii="Times New Roman" w:hAnsi="Times New Roman" w:eastAsia="Times New Roman"/>
+          <w:sz w:val="24"/>
+        </w:rPr>
+        <w:t xml:space="preserve">ø</w:t>
+      </w:r>
+      <w:r>
+        <w:rPr>
+          <w:rFonts w:ascii="Times New Roman" w:hAnsi="Times New Roman" w:eastAsia="Times New Roman"/>
+          <w:sz w:val="24"/>
+        </w:rPr>
+        <w:t xml:space="preserve">, Pish, and their macro average. Error bars show descriptive population standard deviation over three fixed training seeds</w:t>
       </w:r>
     </w:p>
     <w:bookmarkEnd w:id="24"/>
@@ -5122,187 +5197,7 @@
           <w:rFonts w:ascii="Times New Roman" w:hAnsi="Times New Roman" w:eastAsia="Times New Roman"/>
           <w:sz w:val="24"/>
         </w:rPr>
-        <w:t xml:space="preserve">The full architecture is not the best pooled configuration (Table </w:t>
-      </w:r>
-      <w:hyperlink w:anchor="tab:ablation">
-        <w:r>
-          <w:rPr>
-            <w:rStyle w:val="Hyperlink"/>
-          </w:rPr>
-          <w:t xml:space="preserve">3</w:t>
-        </w:r>
-      </w:hyperlink>
-      <w:r>
-        <w:rPr>
-          <w:rFonts w:ascii="Times New Roman" w:hAnsi="Times New Roman" w:eastAsia="Times New Roman"/>
-          <w:sz w:val="24"/>
-        </w:rPr>
-        <w:t xml:space="preserve">). Removing aspect and its fixed-reference coordinate or removing cross-attention increases pooled macro F1 to</w:t>
-      </w:r>
-      <w:r>
-        <w:rPr>
-          <w:rFonts w:ascii="Times New Roman" w:hAnsi="Times New Roman" w:eastAsia="Times New Roman"/>
-          <w:sz w:val="24"/>
-        </w:rPr>
-        <w:t xml:space="preserve"> </w:t>
-      </w:r>
-      <m:oMath>
-        <m:r>
-          <m:t>65.35</m:t>
-        </m:r>
-        <m:r>
-          <m:rPr>
-            <m:sty m:val="p"/>
-          </m:rPr>
-          <m:t>%</m:t>
-        </m:r>
-      </m:oMath>
-      <w:r>
-        <w:rPr>
-          <w:rFonts w:ascii="Times New Roman" w:hAnsi="Times New Roman" w:eastAsia="Times New Roman"/>
-          <w:sz w:val="24"/>
-        </w:rPr>
-        <w:t xml:space="preserve"> </w:t>
-      </w:r>
-      <w:r>
-        <w:rPr>
-          <w:rFonts w:ascii="Times New Roman" w:hAnsi="Times New Roman" w:eastAsia="Times New Roman"/>
-          <w:sz w:val="24"/>
-        </w:rPr>
-        <w:t xml:space="preserve">and</w:t>
-      </w:r>
-      <w:r>
-        <w:rPr>
-          <w:rFonts w:ascii="Times New Roman" w:hAnsi="Times New Roman" w:eastAsia="Times New Roman"/>
-          <w:sz w:val="24"/>
-        </w:rPr>
-        <w:t xml:space="preserve"> </w:t>
-      </w:r>
-      <m:oMath>
-        <m:r>
-          <m:t>65.07</m:t>
-        </m:r>
-        <m:r>
-          <m:rPr>
-            <m:sty m:val="p"/>
-          </m:rPr>
-          <m:t>%</m:t>
-        </m:r>
-      </m:oMath>
-      <w:r>
-        <w:rPr>
-          <w:rFonts w:ascii="Times New Roman" w:hAnsi="Times New Roman" w:eastAsia="Times New Roman"/>
-          <w:sz w:val="24"/>
-        </w:rPr>
-        <w:t xml:space="preserve">, respectively, mainly through gains in Pish. In Troms</w:t>
-      </w:r>
-      <w:r>
-        <w:rPr>
-          <w:rFonts w:ascii="Times New Roman" w:hAnsi="Times New Roman" w:eastAsia="Times New Roman"/>
-          <w:sz w:val="24"/>
-        </w:rPr>
-        <w:t xml:space="preserve">ø</w:t>
-      </w:r>
-      <w:r>
-        <w:rPr>
-          <w:rFonts w:ascii="Times New Roman" w:hAnsi="Times New Roman" w:eastAsia="Times New Roman"/>
-          <w:sz w:val="24"/>
-        </w:rPr>
-        <w:t xml:space="preserve">, seed-42 paired block tests favour the full model over No-LIA by</w:t>
-      </w:r>
-      <w:r>
-        <w:rPr>
-          <w:rFonts w:ascii="Times New Roman" w:hAnsi="Times New Roman" w:eastAsia="Times New Roman"/>
-          <w:sz w:val="24"/>
-        </w:rPr>
-        <w:t xml:space="preserve"> </w:t>
-      </w:r>
-      <m:oMath>
-        <m:r>
-          <m:t>2.04</m:t>
-        </m:r>
-      </m:oMath>
-      <w:r>
-        <w:rPr>
-          <w:rFonts w:ascii="Times New Roman" w:hAnsi="Times New Roman" w:eastAsia="Times New Roman"/>
-          <w:sz w:val="24"/>
-        </w:rPr>
-        <w:t xml:space="preserve"> </w:t>
-      </w:r>
-      <w:r>
-        <w:rPr>
-          <w:rFonts w:ascii="Times New Roman" w:hAnsi="Times New Roman" w:eastAsia="Times New Roman"/>
-          <w:sz w:val="24"/>
-        </w:rPr>
-        <w:t xml:space="preserve">percentage points (</w:t>
-      </w:r>
-      <m:oMath>
-        <m:r>
-          <m:t>p</m:t>
-        </m:r>
-        <m:r>
-          <m:rPr>
-            <m:sty m:val="p"/>
-          </m:rPr>
-          <m:t>&lt;</m:t>
-        </m:r>
-        <m:r>
-          <m:t>0.001</m:t>
-        </m:r>
-      </m:oMath>
-      <w:r>
-        <w:rPr>
-          <w:rFonts w:ascii="Times New Roman" w:hAnsi="Times New Roman" w:eastAsia="Times New Roman"/>
-          <w:sz w:val="24"/>
-        </w:rPr>
-        <w:t xml:space="preserve">) and No-CrossAttn by</w:t>
-      </w:r>
-      <w:r>
-        <w:rPr>
-          <w:rFonts w:ascii="Times New Roman" w:hAnsi="Times New Roman" w:eastAsia="Times New Roman"/>
-          <w:sz w:val="24"/>
-        </w:rPr>
-        <w:t xml:space="preserve"> </w:t>
-      </w:r>
-      <m:oMath>
-        <m:r>
-          <m:t>1.42</m:t>
-        </m:r>
-      </m:oMath>
-      <w:r>
-        <w:rPr>
-          <w:rFonts w:ascii="Times New Roman" w:hAnsi="Times New Roman" w:eastAsia="Times New Roman"/>
-          <w:sz w:val="24"/>
-        </w:rPr>
-        <w:t xml:space="preserve"> </w:t>
-      </w:r>
-      <w:r>
-        <w:rPr>
-          <w:rFonts w:ascii="Times New Roman" w:hAnsi="Times New Roman" w:eastAsia="Times New Roman"/>
-          <w:sz w:val="24"/>
-        </w:rPr>
-        <w:t xml:space="preserve">percentage points (</w:t>
-      </w:r>
-      <m:oMath>
-        <m:r>
-          <m:t>p</m:t>
-        </m:r>
-        <m:r>
-          <m:rPr>
-            <m:sty m:val="p"/>
-          </m:rPr>
-          <m:t>=</m:t>
-        </m:r>
-        <m:r>
-          <m:t>0.010</m:t>
-        </m:r>
-      </m:oMath>
-      <w:r>
-        <w:rPr>
-          <w:rFonts w:ascii="Times New Roman" w:hAnsi="Times New Roman" w:eastAsia="Times New Roman"/>
-          <w:sz w:val="24"/>
-        </w:rPr>
-        <w:t xml:space="preserve">). These comparisons establish component sensitivity, not a causal terrain-correction mechanism.</w:t>
+        <w:t>The full architecture is not the best pooled configuration (Table 3). Removing aspect and its fixed-reference coordinate or removing cross-attention increases pooled macro F1 to 65.35% and 65.07%, respectively, mainly through gains in Pish. In Tromsø, seed-42 paired block tests favour the full model over No-LIA by 2.04 percentage points (p&lt;0.001) and No-CrossAttn by 1.42 percentage points (p=0.010). These comparisons establish component sensitivity, not a causal terrain-correction mechanism.</w:t>
       </w:r>
     </w:p>
     <w:bookmarkStart w:id="26" w:name="tab:ablation"/>
@@ -5324,7 +5219,7 @@
           <w:rFonts w:ascii="Times New Roman" w:hAnsi="Times New Roman" w:eastAsia="Times New Roman"/>
           <w:sz w:val="24"/>
         </w:rPr>
-        <w:t>Ablation performance across three seeds. The highest pooled value is obtained without aspect and its fixed-reference coordinate</w:t>
+        <w:t xml:space="preserve">Ablation performance across three seeds. The highest pooled value is obtained without aspect and its fixed-reference coordinate</w:t>
       </w:r>
     </w:p>
     <w:tbl>
@@ -6517,434 +6412,7 @@
           <w:rFonts w:ascii="Times New Roman" w:hAnsi="Times New Roman" w:eastAsia="Times New Roman"/>
           <w:sz w:val="24"/>
         </w:rPr>
-        <w:t xml:space="preserve">The affine valid-mask area is</w:t>
-      </w:r>
-      <w:r>
-        <w:rPr>
-          <w:rFonts w:ascii="Times New Roman" w:hAnsi="Times New Roman" w:eastAsia="Times New Roman"/>
-          <w:sz w:val="24"/>
-        </w:rPr>
-        <w:t xml:space="preserve"> </w:t>
-      </w:r>
-      <m:oMath>
-        <m:r>
-          <m:t>196.820</m:t>
-        </m:r>
-        <m:r>
-          <m:t> </m:t>
-        </m:r>
-        <m:sSup>
-          <m:e>
-            <m:r>
-              <m:rPr>
-                <m:sty m:val="p"/>
-              </m:rPr>
-              <m:t>k</m:t>
-            </m:r>
-            <m:r>
-              <m:rPr>
-                <m:sty m:val="p"/>
-              </m:rPr>
-              <m:t>m</m:t>
-            </m:r>
-          </m:e>
-          <m:sup>
-            <m:r>
-              <m:t>2</m:t>
-            </m:r>
-          </m:sup>
-        </m:sSup>
-      </m:oMath>
-      <w:r>
-        <w:rPr>
-          <w:rFonts w:ascii="Times New Roman" w:hAnsi="Times New Roman" w:eastAsia="Times New Roman"/>
-          <w:sz w:val="24"/>
-        </w:rPr>
-        <w:t xml:space="preserve"> </w:t>
-      </w:r>
-      <w:r>
-        <w:rPr>
-          <w:rFonts w:ascii="Times New Roman" w:hAnsi="Times New Roman" w:eastAsia="Times New Roman"/>
-          <w:sz w:val="24"/>
-        </w:rPr>
-        <w:t xml:space="preserve">in Troms</w:t>
-      </w:r>
-      <w:r>
-        <w:rPr>
-          <w:rFonts w:ascii="Times New Roman" w:hAnsi="Times New Roman" w:eastAsia="Times New Roman"/>
-          <w:sz w:val="24"/>
-        </w:rPr>
-        <w:t xml:space="preserve">ø</w:t>
-      </w:r>
-      <w:r>
-        <w:rPr>
-          <w:rFonts w:ascii="Times New Roman" w:hAnsi="Times New Roman" w:eastAsia="Times New Roman"/>
-          <w:sz w:val="24"/>
-        </w:rPr>
-        <w:t xml:space="preserve"> </w:t>
-      </w:r>
-      <w:r>
-        <w:rPr>
-          <w:rFonts w:ascii="Times New Roman" w:hAnsi="Times New Roman" w:eastAsia="Times New Roman"/>
-          <w:sz w:val="24"/>
-        </w:rPr>
-        <w:t xml:space="preserve">and</w:t>
-      </w:r>
-      <w:r>
-        <w:rPr>
-          <w:rFonts w:ascii="Times New Roman" w:hAnsi="Times New Roman" w:eastAsia="Times New Roman"/>
-          <w:sz w:val="24"/>
-        </w:rPr>
-        <w:t xml:space="preserve"> </w:t>
-      </w:r>
-      <m:oMath>
-        <m:r>
-          <m:t>267.435</m:t>
-        </m:r>
-        <m:r>
-          <m:t> </m:t>
-        </m:r>
-        <m:sSup>
-          <m:e>
-            <m:r>
-              <m:rPr>
-                <m:sty m:val="p"/>
-              </m:rPr>
-              <m:t>k</m:t>
-            </m:r>
-            <m:r>
-              <m:rPr>
-                <m:sty m:val="p"/>
-              </m:rPr>
-              <m:t>m</m:t>
-            </m:r>
-          </m:e>
-          <m:sup>
-            <m:r>
-              <m:t>2</m:t>
-            </m:r>
-          </m:sup>
-        </m:sSup>
-      </m:oMath>
-      <w:r>
-        <w:rPr>
-          <w:rFonts w:ascii="Times New Roman" w:hAnsi="Times New Roman" w:eastAsia="Times New Roman"/>
-          <w:sz w:val="24"/>
-        </w:rPr>
-        <w:t xml:space="preserve"> </w:t>
-      </w:r>
-      <w:r>
-        <w:rPr>
-          <w:rFonts w:ascii="Times New Roman" w:hAnsi="Times New Roman" w:eastAsia="Times New Roman"/>
-          <w:sz w:val="24"/>
-        </w:rPr>
-        <w:t xml:space="preserve">in Pish. In Troms</w:t>
-      </w:r>
-      <w:r>
-        <w:rPr>
-          <w:rFonts w:ascii="Times New Roman" w:hAnsi="Times New Roman" w:eastAsia="Times New Roman"/>
-          <w:sz w:val="24"/>
-        </w:rPr>
-        <w:t xml:space="preserve">ø</w:t>
-      </w:r>
-      <w:r>
-        <w:rPr>
-          <w:rFonts w:ascii="Times New Roman" w:hAnsi="Times New Roman" w:eastAsia="Times New Roman"/>
-          <w:sz w:val="24"/>
-        </w:rPr>
-        <w:t xml:space="preserve">, TopoRadar-Net produces</w:t>
-      </w:r>
-      <w:r>
-        <w:rPr>
-          <w:rFonts w:ascii="Times New Roman" w:hAnsi="Times New Roman" w:eastAsia="Times New Roman"/>
-          <w:sz w:val="24"/>
-        </w:rPr>
-        <w:t xml:space="preserve"> </w:t>
-      </w:r>
-      <m:oMath>
-        <m:r>
-          <m:t>74.77</m:t>
-        </m:r>
-      </m:oMath>
-      <w:r>
-        <w:rPr>
-          <w:rFonts w:ascii="Times New Roman" w:hAnsi="Times New Roman" w:eastAsia="Times New Roman"/>
-          <w:sz w:val="24"/>
-        </w:rPr>
-        <w:t xml:space="preserve"> </w:t>
-      </w:r>
-      <w:r>
-        <w:rPr>
-          <w:rFonts w:ascii="Times New Roman" w:hAnsi="Times New Roman" w:eastAsia="Times New Roman"/>
-          <w:sz w:val="24"/>
-        </w:rPr>
-        <w:t xml:space="preserve">ha of false positives at</w:t>
-      </w:r>
-      <w:r>
-        <w:rPr>
-          <w:rFonts w:ascii="Times New Roman" w:hAnsi="Times New Roman" w:eastAsia="Times New Roman"/>
-          <w:sz w:val="24"/>
-        </w:rPr>
-        <w:t xml:space="preserve"> </w:t>
-      </w:r>
-      <m:oMath>
-        <m:r>
-          <m:t>0.38</m:t>
-        </m:r>
-        <m:r>
-          <m:t> </m:t>
-        </m:r>
-        <m:sSup>
-          <m:e>
-            <m:r>
-              <m:rPr>
-                <m:sty m:val="p"/>
-              </m:rPr>
-              <m:t>h</m:t>
-            </m:r>
-            <m:r>
-              <m:rPr>
-                <m:sty m:val="p"/>
-              </m:rPr>
-              <m:t>a</m:t>
-            </m:r>
-            <m:r>
-              <m:rPr>
-                <m:sty m:val="p"/>
-              </m:rPr>
-              <m:t> </m:t>
-            </m:r>
-            <m:r>
-              <m:rPr>
-                <m:sty m:val="p"/>
-              </m:rPr>
-              <m:t>k</m:t>
-            </m:r>
-            <m:r>
-              <m:rPr>
-                <m:sty m:val="p"/>
-              </m:rPr>
-              <m:t>m</m:t>
-            </m:r>
-          </m:e>
-          <m:sup>
-            <m:r>
-              <m:rPr>
-                <m:sty m:val="p"/>
-              </m:rPr>
-              <m:t>−</m:t>
-            </m:r>
-            <m:r>
-              <m:t>2</m:t>
-            </m:r>
-          </m:sup>
-        </m:sSup>
-      </m:oMath>
-      <w:r>
-        <w:rPr>
-          <w:rFonts w:ascii="Times New Roman" w:hAnsi="Times New Roman" w:eastAsia="Times New Roman"/>
-          <w:sz w:val="24"/>
-        </w:rPr>
-        <w:t xml:space="preserve">. In Pish, it produces</w:t>
-      </w:r>
-      <w:r>
-        <w:rPr>
-          <w:rFonts w:ascii="Times New Roman" w:hAnsi="Times New Roman" w:eastAsia="Times New Roman"/>
-          <w:sz w:val="24"/>
-        </w:rPr>
-        <w:t xml:space="preserve"> </w:t>
-      </w:r>
-      <m:oMath>
-        <m:r>
-          <m:t>129.69</m:t>
-        </m:r>
-      </m:oMath>
-      <w:r>
-        <w:rPr>
-          <w:rFonts w:ascii="Times New Roman" w:hAnsi="Times New Roman" w:eastAsia="Times New Roman"/>
-          <w:sz w:val="24"/>
-        </w:rPr>
-        <w:t xml:space="preserve"> </w:t>
-      </w:r>
-      <w:r>
-        <w:rPr>
-          <w:rFonts w:ascii="Times New Roman" w:hAnsi="Times New Roman" w:eastAsia="Times New Roman"/>
-          <w:sz w:val="24"/>
-        </w:rPr>
-        <w:t xml:space="preserve">ha at</w:t>
-      </w:r>
-      <w:r>
-        <w:rPr>
-          <w:rFonts w:ascii="Times New Roman" w:hAnsi="Times New Roman" w:eastAsia="Times New Roman"/>
-          <w:sz w:val="24"/>
-        </w:rPr>
-        <w:t xml:space="preserve"> </w:t>
-      </w:r>
-      <m:oMath>
-        <m:r>
-          <m:t>0.48</m:t>
-        </m:r>
-        <m:r>
-          <m:t> </m:t>
-        </m:r>
-        <m:sSup>
-          <m:e>
-            <m:r>
-              <m:rPr>
-                <m:sty m:val="p"/>
-              </m:rPr>
-              <m:t>h</m:t>
-            </m:r>
-            <m:r>
-              <m:rPr>
-                <m:sty m:val="p"/>
-              </m:rPr>
-              <m:t>a</m:t>
-            </m:r>
-            <m:r>
-              <m:rPr>
-                <m:sty m:val="p"/>
-              </m:rPr>
-              <m:t> </m:t>
-            </m:r>
-            <m:r>
-              <m:rPr>
-                <m:sty m:val="p"/>
-              </m:rPr>
-              <m:t>k</m:t>
-            </m:r>
-            <m:r>
-              <m:rPr>
-                <m:sty m:val="p"/>
-              </m:rPr>
-              <m:t>m</m:t>
-            </m:r>
-          </m:e>
-          <m:sup>
-            <m:r>
-              <m:rPr>
-                <m:sty m:val="p"/>
-              </m:rPr>
-              <m:t>−</m:t>
-            </m:r>
-            <m:r>
-              <m:t>2</m:t>
-            </m:r>
-          </m:sup>
-        </m:sSup>
-      </m:oMath>
-      <w:r>
-        <w:rPr>
-          <w:rFonts w:ascii="Times New Roman" w:hAnsi="Times New Roman" w:eastAsia="Times New Roman"/>
-          <w:sz w:val="24"/>
-        </w:rPr>
-        <w:t xml:space="preserve">. Relative to the self-attention U-Net, this is a 30.0% reduction in Pish (129.69 versus 185.32 ha) but a 28.5% increase in Troms</w:t>
-      </w:r>
-      <w:r>
-        <w:rPr>
-          <w:rFonts w:ascii="Times New Roman" w:hAnsi="Times New Roman" w:eastAsia="Times New Roman"/>
-          <w:sz w:val="24"/>
-        </w:rPr>
-        <w:t xml:space="preserve">ø</w:t>
-      </w:r>
-      <w:r>
-        <w:rPr>
-          <w:rFonts w:ascii="Times New Roman" w:hAnsi="Times New Roman" w:eastAsia="Times New Roman"/>
-          <w:sz w:val="24"/>
-        </w:rPr>
-        <w:t xml:space="preserve"> </w:t>
-      </w:r>
-      <w:r>
-        <w:rPr>
-          <w:rFonts w:ascii="Times New Roman" w:hAnsi="Times New Roman" w:eastAsia="Times New Roman"/>
-          <w:sz w:val="24"/>
-        </w:rPr>
-        <w:t xml:space="preserve">(74.77 versus 58.19 ha). Validation-calibrated road-corridor alerts achieve</w:t>
-      </w:r>
-      <w:r>
-        <w:rPr>
-          <w:rFonts w:ascii="Times New Roman" w:hAnsi="Times New Roman" w:eastAsia="Times New Roman"/>
-          <w:sz w:val="24"/>
-        </w:rPr>
-        <w:t xml:space="preserve"> </w:t>
-      </w:r>
-      <m:oMath>
-        <m:r>
-          <m:t>83.0</m:t>
-        </m:r>
-        <m:r>
-          <m:rPr>
-            <m:sty m:val="p"/>
-          </m:rPr>
-          <m:t>%</m:t>
-        </m:r>
-      </m:oMath>
-      <w:r>
-        <w:rPr>
-          <w:rFonts w:ascii="Times New Roman" w:hAnsi="Times New Roman" w:eastAsia="Times New Roman"/>
-          <w:sz w:val="24"/>
-        </w:rPr>
-        <w:t xml:space="preserve"> </w:t>
-      </w:r>
-      <w:r>
-        <w:rPr>
-          <w:rFonts w:ascii="Times New Roman" w:hAnsi="Times New Roman" w:eastAsia="Times New Roman"/>
-          <w:sz w:val="24"/>
-        </w:rPr>
-        <w:t xml:space="preserve">precision and</w:t>
-      </w:r>
-      <w:r>
-        <w:rPr>
-          <w:rFonts w:ascii="Times New Roman" w:hAnsi="Times New Roman" w:eastAsia="Times New Roman"/>
-          <w:sz w:val="24"/>
-        </w:rPr>
-        <w:t xml:space="preserve"> </w:t>
-      </w:r>
-      <m:oMath>
-        <m:r>
-          <m:t>62.5</m:t>
-        </m:r>
-        <m:r>
-          <m:rPr>
-            <m:sty m:val="p"/>
-          </m:rPr>
-          <m:t>%</m:t>
-        </m:r>
-      </m:oMath>
-      <w:r>
-        <w:rPr>
-          <w:rFonts w:ascii="Times New Roman" w:hAnsi="Times New Roman" w:eastAsia="Times New Roman"/>
-          <w:sz w:val="24"/>
-        </w:rPr>
-        <w:t xml:space="preserve"> </w:t>
-      </w:r>
-      <w:r>
-        <w:rPr>
-          <w:rFonts w:ascii="Times New Roman" w:hAnsi="Times New Roman" w:eastAsia="Times New Roman"/>
-          <w:sz w:val="24"/>
-        </w:rPr>
-        <w:t xml:space="preserve">recall in Pish. The single road-intersecting reference avalanche in Troms</w:t>
-      </w:r>
-      <w:r>
-        <w:rPr>
-          <w:rFonts w:ascii="Times New Roman" w:hAnsi="Times New Roman" w:eastAsia="Times New Roman"/>
-          <w:sz w:val="24"/>
-        </w:rPr>
-        <w:t xml:space="preserve">ø</w:t>
-      </w:r>
-      <w:r>
-        <w:rPr>
-          <w:rFonts w:ascii="Times New Roman" w:hAnsi="Times New Roman" w:eastAsia="Times New Roman"/>
-          <w:sz w:val="24"/>
-        </w:rPr>
-        <w:t xml:space="preserve"> </w:t>
-      </w:r>
-      <w:r>
-        <w:rPr>
-          <w:rFonts w:ascii="Times New Roman" w:hAnsi="Times New Roman" w:eastAsia="Times New Roman"/>
-          <w:sz w:val="24"/>
-        </w:rPr>
-        <w:t xml:space="preserve">is missed by every TopoRadar-Net seed. All cached complete-scene runs are below 5 s on Apple MPS hardware, but timing excludes upstream acquisition and human review.</w:t>
+        <w:t>The affine valid-mask area is 196.820 km² in Tromsø and 267.435 km² in Pish. In Tromsø, TopoRadar-Net produces 74.77 ha of false positives at 0.38 ha km⁻². In Pish, it produces 129.69 ha at 0.48 ha km⁻². Relative to the self-attention U-Net, this is a 30.0% reduction in Pish (129.69 versus 185.32 ha) but a 28.5% increase in Tromsø (74.77 versus 58.19 ha). Validation-calibrated road-corridor alerts achieve 83.0% precision and 62.5% recall in Pish. The single road-intersecting reference avalanche in Tromsø is missed by every TopoRadar-Net seed. All cached complete-scene runs are below 5 s on Apple MPS hardware, but timing excludes upstream acquisition and human review.</w:t>
       </w:r>
     </w:p>
     <w:bookmarkEnd w:id="28"/>
@@ -7902,7 +7370,30 @@
           <w:rFonts w:ascii="Times New Roman" w:hAnsi="Times New Roman" w:eastAsia="Times New Roman"/>
           <w:sz w:val="24"/>
         </w:rPr>
-        <w:t xml:space="preserve">.</w:t>
+        <w:t xml:space="preserve">,</w:t>
+      </w:r>
+      <w:r>
+        <w:rPr>
+          <w:rFonts w:ascii="Times New Roman" w:hAnsi="Times New Roman" w:eastAsia="Times New Roman"/>
+          <w:sz w:val="24"/>
+        </w:rPr>
+        <w:t xml:space="preserve"> </w:t>
+      </w:r>
+      <w:r>
+        <w:rPr>
+          <w:rFonts w:ascii="Times New Roman" w:hAnsi="Times New Roman" w:eastAsia="Times New Roman"/>
+          <w:i/>
+          <w:iCs/>
+          <w:sz w:val="24"/>
+        </w:rPr>
+        <w:t xml:space="preserve">53</w:t>
+      </w:r>
+      <w:r>
+        <w:rPr>
+          <w:rFonts w:ascii="Times New Roman" w:hAnsi="Times New Roman" w:eastAsia="Times New Roman"/>
+          <w:sz w:val="24"/>
+        </w:rPr>
+        <w:t xml:space="preserve">, 1–21.</w:t>
       </w:r>
       <w:r>
         <w:rPr>
@@ -8453,35 +7944,7 @@
           <w:rFonts w:ascii="Times New Roman" w:hAnsi="Times New Roman" w:eastAsia="Times New Roman"/>
           <w:sz w:val="24"/>
         </w:rPr>
-        <w:t xml:space="preserve">Gatti, M., Mariani, A., Gallo, I., &amp; Monti, F. (2026). Large-scale avalanche mapping from</w:t>
-      </w:r>
-      <w:r>
-        <w:rPr>
-          <w:rFonts w:ascii="Times New Roman" w:hAnsi="Times New Roman" w:eastAsia="Times New Roman"/>
-          <w:sz w:val="24"/>
-        </w:rPr>
-        <w:t xml:space="preserve"> </w:t>
-      </w:r>
-      <w:r>
-        <w:rPr>
-          <w:rFonts w:ascii="Times New Roman" w:hAnsi="Times New Roman" w:eastAsia="Times New Roman"/>
-          <w:sz w:val="24"/>
-        </w:rPr>
-        <w:t xml:space="preserve">SAR</w:t>
-      </w:r>
-      <w:r>
-        <w:rPr>
-          <w:rFonts w:ascii="Times New Roman" w:hAnsi="Times New Roman" w:eastAsia="Times New Roman"/>
-          <w:sz w:val="24"/>
-        </w:rPr>
-        <w:t xml:space="preserve"> </w:t>
-      </w:r>
-      <w:r>
-        <w:rPr>
-          <w:rFonts w:ascii="Times New Roman" w:hAnsi="Times New Roman" w:eastAsia="Times New Roman"/>
-          <w:sz w:val="24"/>
-        </w:rPr>
-        <w:t xml:space="preserve">images with deep learning-based change detection.</w:t>
+        <w:t xml:space="preserve">Gatti, M., Mariani, A., Gallo, I., &amp; Monti, F. (2026).</w:t>
       </w:r>
       <w:r>
         <w:rPr>
@@ -8497,14 +7960,50 @@
           <w:iCs/>
           <w:sz w:val="24"/>
         </w:rPr>
-        <w:t xml:space="preserve">arXiv Preprint arXiv:2603.22658</w:t>
-      </w:r>
-      <w:r>
-        <w:rPr>
-          <w:rFonts w:ascii="Times New Roman" w:hAnsi="Times New Roman" w:eastAsia="Times New Roman"/>
-          <w:sz w:val="24"/>
-        </w:rPr>
-        <w:t xml:space="preserve">.</w:t>
+        <w:t xml:space="preserve">Large-scale avalanche mapping from</w:t>
+      </w:r>
+      <w:r>
+        <w:rPr>
+          <w:rFonts w:ascii="Times New Roman" w:hAnsi="Times New Roman" w:eastAsia="Times New Roman"/>
+          <w:i/>
+          <w:iCs/>
+          <w:sz w:val="24"/>
+        </w:rPr>
+        <w:t xml:space="preserve"> </w:t>
+      </w:r>
+      <w:r>
+        <w:rPr>
+          <w:rFonts w:ascii="Times New Roman" w:hAnsi="Times New Roman" w:eastAsia="Times New Roman"/>
+          <w:i/>
+          <w:iCs/>
+          <w:sz w:val="24"/>
+        </w:rPr>
+        <w:t xml:space="preserve">SAR</w:t>
+      </w:r>
+      <w:r>
+        <w:rPr>
+          <w:rFonts w:ascii="Times New Roman" w:hAnsi="Times New Roman" w:eastAsia="Times New Roman"/>
+          <w:i/>
+          <w:iCs/>
+          <w:sz w:val="24"/>
+        </w:rPr>
+        <w:t xml:space="preserve"> </w:t>
+      </w:r>
+      <w:r>
+        <w:rPr>
+          <w:rFonts w:ascii="Times New Roman" w:hAnsi="Times New Roman" w:eastAsia="Times New Roman"/>
+          <w:i/>
+          <w:iCs/>
+          <w:sz w:val="24"/>
+        </w:rPr>
+        <w:t xml:space="preserve">images with deep learning-based change detection</w:t>
+      </w:r>
+      <w:r>
+        <w:rPr>
+          <w:rFonts w:ascii="Times New Roman" w:hAnsi="Times New Roman" w:eastAsia="Times New Roman"/>
+          <w:sz w:val="24"/>
+        </w:rPr>
+        <w:t xml:space="preserve">. arXiv preprint arXiv:2603.22658.</w:t>
       </w:r>
       <w:r>
         <w:rPr>
@@ -8518,7 +8017,7 @@
           <w:rPr>
             <w:rStyle w:val="Hyperlink"/>
           </w:rPr>
-          <w:t xml:space="preserve">https://arxiv.org/abs/2603.22658</w:t>
+          <w:t xml:space="preserve">https://doi.org/10.48550/arXiv.2603.22658</w:t>
         </w:r>
       </w:hyperlink>
     </w:p>
@@ -8557,7 +8056,30 @@
           <w:rFonts w:ascii="Times New Roman" w:hAnsi="Times New Roman" w:eastAsia="Times New Roman"/>
           <w:sz w:val="24"/>
         </w:rPr>
-        <w:t xml:space="preserve">.</w:t>
+        <w:t xml:space="preserve">,</w:t>
+      </w:r>
+      <w:r>
+        <w:rPr>
+          <w:rFonts w:ascii="Times New Roman" w:hAnsi="Times New Roman" w:eastAsia="Times New Roman"/>
+          <w:sz w:val="24"/>
+        </w:rPr>
+        <w:t xml:space="preserve"> </w:t>
+      </w:r>
+      <w:r>
+        <w:rPr>
+          <w:rFonts w:ascii="Times New Roman" w:hAnsi="Times New Roman" w:eastAsia="Times New Roman"/>
+          <w:i/>
+          <w:iCs/>
+          <w:sz w:val="24"/>
+        </w:rPr>
+        <w:t xml:space="preserve">53</w:t>
+      </w:r>
+      <w:r>
+        <w:rPr>
+          <w:rFonts w:ascii="Times New Roman" w:hAnsi="Times New Roman" w:eastAsia="Times New Roman"/>
+          <w:sz w:val="24"/>
+        </w:rPr>
+        <w:t xml:space="preserve">, 1–23.</w:t>
       </w:r>
       <w:r>
         <w:rPr>

</xml_diff>

<commit_message>
release: harden JISRS citation and preview gates
</commit_message>
<xml_diff>
--- a/submission-jisrs/JISRS_Main_Manuscript_Anonymous.docx
+++ b/submission-jisrs/JISRS_Main_Manuscript_Anonymous.docx
@@ -7331,53 +7331,11 @@
       <w:r>
         <w:rPr>
           <w:rFonts w:ascii="Times New Roman" w:hAnsi="Times New Roman" w:eastAsia="Times New Roman"/>
-          <w:sz w:val="24"/>
-        </w:rPr>
-        <w:t xml:space="preserve">YOLOv5</w:t>
-      </w:r>
-      <w:r>
-        <w:rPr>
-          <w:rFonts w:ascii="Times New Roman" w:hAnsi="Times New Roman" w:eastAsia="Times New Roman"/>
-          <w:sz w:val="24"/>
-        </w:rPr>
-        <w:t xml:space="preserve"> </w:t>
-      </w:r>
-      <w:r>
-        <w:rPr>
-          <w:rFonts w:ascii="Times New Roman" w:hAnsi="Times New Roman" w:eastAsia="Times New Roman"/>
-          <w:sz w:val="24"/>
-        </w:rPr>
-        <w:t xml:space="preserve">based on attention mechanism for landslide information extraction from multi-source remote sensing images of diverse geological environments.</w:t>
-      </w:r>
-      <w:r>
-        <w:rPr>
-          <w:rFonts w:ascii="Times New Roman" w:hAnsi="Times New Roman" w:eastAsia="Times New Roman"/>
-          <w:sz w:val="24"/>
-        </w:rPr>
-        <w:t xml:space="preserve"> </w:t>
-      </w:r>
-      <w:r>
-        <w:rPr>
-          <w:rFonts w:ascii="Times New Roman" w:hAnsi="Times New Roman" w:eastAsia="Times New Roman"/>
           <w:i/>
           <w:iCs/>
           <w:sz w:val="24"/>
         </w:rPr>
-        <w:t xml:space="preserve">Journal of the Indian Society of Remote Sensing</w:t>
-      </w:r>
-      <w:r>
-        <w:rPr>
-          <w:rFonts w:ascii="Times New Roman" w:hAnsi="Times New Roman" w:eastAsia="Times New Roman"/>
-          <w:sz w:val="24"/>
-        </w:rPr>
-        <w:t xml:space="preserve">,</w:t>
-      </w:r>
-      <w:r>
-        <w:rPr>
-          <w:rFonts w:ascii="Times New Roman" w:hAnsi="Times New Roman" w:eastAsia="Times New Roman"/>
-          <w:sz w:val="24"/>
-        </w:rPr>
-        <w:t xml:space="preserve"> </w:t>
+        <w:t xml:space="preserve">YOLOv5</w:t>
       </w:r>
       <w:r>
         <w:rPr>
@@ -7386,14 +7344,23 @@
           <w:iCs/>
           <w:sz w:val="24"/>
         </w:rPr>
-        <w:t xml:space="preserve">53</w:t>
-      </w:r>
-      <w:r>
-        <w:rPr>
-          <w:rFonts w:ascii="Times New Roman" w:hAnsi="Times New Roman" w:eastAsia="Times New Roman"/>
-          <w:sz w:val="24"/>
-        </w:rPr>
-        <w:t xml:space="preserve">, 1–21.</w:t>
+        <w:t xml:space="preserve"> </w:t>
+      </w:r>
+      <w:r>
+        <w:rPr>
+          <w:rFonts w:ascii="Times New Roman" w:hAnsi="Times New Roman" w:eastAsia="Times New Roman"/>
+          <w:i/>
+          <w:iCs/>
+          <w:sz w:val="24"/>
+        </w:rPr>
+        <w:t xml:space="preserve">based on attention mechanism for landslide information extraction from multi-source remote sensing images of diverse geological environments</w:t>
+      </w:r>
+      <w:r>
+        <w:rPr>
+          <w:rFonts w:ascii="Times New Roman" w:hAnsi="Times New Roman" w:eastAsia="Times New Roman"/>
+          <w:sz w:val="24"/>
+        </w:rPr>
+        <w:t xml:space="preserve">. Advance online publication in the Journal of the Indian Society of Remote Sensing.</w:t>
       </w:r>
       <w:r>
         <w:rPr>
@@ -8033,7 +8000,7 @@
           <w:rFonts w:ascii="Times New Roman" w:hAnsi="Times New Roman" w:eastAsia="Times New Roman"/>
           <w:sz w:val="24"/>
         </w:rPr>
-        <w:t xml:space="preserve">Nguyen, H., Dang, K. B., Giang, T. L., Dang, V. B., Dang, N. V., &amp; Dao, M. D. (2025). Exploring various deep learning models for high-precision landslide tracing in very-high resolution remote sensing imagery.</w:t>
+        <w:t xml:space="preserve">Nguyen, H., Dang, K. B., Giang, T. L., Dang, V. B., Dang, N. V., &amp; Dao, M. D. (2025).</w:t>
       </w:r>
       <w:r>
         <w:rPr>
@@ -8049,37 +8016,14 @@
           <w:iCs/>
           <w:sz w:val="24"/>
         </w:rPr>
-        <w:t xml:space="preserve">Journal of the Indian Society of Remote Sensing</w:t>
-      </w:r>
-      <w:r>
-        <w:rPr>
-          <w:rFonts w:ascii="Times New Roman" w:hAnsi="Times New Roman" w:eastAsia="Times New Roman"/>
-          <w:sz w:val="24"/>
-        </w:rPr>
-        <w:t xml:space="preserve">,</w:t>
-      </w:r>
-      <w:r>
-        <w:rPr>
-          <w:rFonts w:ascii="Times New Roman" w:hAnsi="Times New Roman" w:eastAsia="Times New Roman"/>
-          <w:sz w:val="24"/>
-        </w:rPr>
-        <w:t xml:space="preserve"> </w:t>
-      </w:r>
-      <w:r>
-        <w:rPr>
-          <w:rFonts w:ascii="Times New Roman" w:hAnsi="Times New Roman" w:eastAsia="Times New Roman"/>
-          <w:i/>
-          <w:iCs/>
-          <w:sz w:val="24"/>
-        </w:rPr>
-        <w:t xml:space="preserve">53</w:t>
-      </w:r>
-      <w:r>
-        <w:rPr>
-          <w:rFonts w:ascii="Times New Roman" w:hAnsi="Times New Roman" w:eastAsia="Times New Roman"/>
-          <w:sz w:val="24"/>
-        </w:rPr>
-        <w:t xml:space="preserve">, 1–23.</w:t>
+        <w:t xml:space="preserve">Exploring various deep learning models for high-precision landslide tracing in very-high resolution remote sensing imagery</w:t>
+      </w:r>
+      <w:r>
+        <w:rPr>
+          <w:rFonts w:ascii="Times New Roman" w:hAnsi="Times New Roman" w:eastAsia="Times New Roman"/>
+          <w:sz w:val="24"/>
+        </w:rPr>
+        <w:t xml:space="preserve">. Advance online publication in the Journal of the Indian Society of Remote Sensing.</w:t>
       </w:r>
       <w:r>
         <w:rPr>

</xml_diff>

<commit_message>
submission: align JISRS package with portal formatting
</commit_message>
<xml_diff>
--- a/submission-jisrs/JISRS_Main_Manuscript_Anonymous.docx
+++ b/submission-jisrs/JISRS_Main_Manuscript_Anonymous.docx
@@ -473,6 +473,7 @@
         <w:rPr>
           <w:rFonts w:ascii="Times New Roman" w:hAnsi="Times New Roman" w:eastAsia="Times New Roman"/>
           <w:b/>
+          <w:i w:val="0"/>
           <w:sz w:val="24"/>
         </w:rPr>
         <w:t xml:space="preserve">Table 1. </w:t>
@@ -480,6 +481,7 @@
       <w:r>
         <w:rPr>
           <w:rFonts w:ascii="Times New Roman" w:hAnsi="Times New Roman" w:eastAsia="Times New Roman"/>
+          <w:i w:val="0"/>
           <w:sz w:val="24"/>
         </w:rPr>
         <w:t xml:space="preserve">AvalCD scenes used in the cross-region study. Debris is the number of labelled positive pixels</w:t>
@@ -1744,7 +1746,7 @@
           <w:rFonts w:ascii="Times New Roman" w:hAnsi="Times New Roman" w:eastAsia="Times New Roman"/>
           <w:sz w:val="24"/>
         </w:rPr>
-        <w:t xml:space="preserve">dB, respectively. The two model positions represent cross/co polarization (VH/VV or HV/HH according to scene), and difference channels retain those positions. The terrain tensor contains local incidence geometry, slope, sine/cosine aspect, elevation, and the fixed coordinate</w:t>
+        <w:t xml:space="preserve">dB, respectively. The two model positions represent cross/co polarization (VH/VV or HV/HH according to scene), and difference channels retain those positions. The terrain tensor contains local incidence angle (LIA), slope, sine/cosine aspect, elevation from a digital elevation model (DEM), and the fixed coordinate</w:t>
       </w:r>
       <w:r>
         <w:rPr>
@@ -2398,7 +2400,7 @@
           <w:rFonts w:ascii="Times New Roman" w:hAnsi="Times New Roman" w:eastAsia="Times New Roman"/>
           <w:sz w:val="24"/>
         </w:rPr>
-        <w:t xml:space="preserve">. A Radar-Topographic Cross-Attention Block forms SAR queries and pooled terrain keys and values,</w:t>
+        <w:t xml:space="preserve">. A Radar-Topographic Cross-Attention Block (RTCAB) forms SAR queries and pooled terrain keys and values,</w:t>
       </w:r>
     </w:p>
     <w:p>
@@ -2805,13 +2807,15 @@
         <w:rPr>
           <w:rFonts w:ascii="Times New Roman" w:hAnsi="Times New Roman" w:eastAsia="Times New Roman"/>
           <w:b/>
-          <w:sz w:val="24"/>
-        </w:rPr>
-        <w:t xml:space="preserve">Fig. 1. </w:t>
-      </w:r>
-      <w:r>
-        <w:rPr>
-          <w:rFonts w:ascii="Times New Roman" w:hAnsi="Times New Roman" w:eastAsia="Times New Roman"/>
+          <w:i w:val="0"/>
+          <w:sz w:val="24"/>
+        </w:rPr>
+        <w:t xml:space="preserve">Fig. 1 </w:t>
+      </w:r>
+      <w:r>
+        <w:rPr>
+          <w:rFonts w:ascii="Times New Roman" w:hAnsi="Times New Roman" w:eastAsia="Times New Roman"/>
+          <w:i w:val="0"/>
           <w:sz w:val="24"/>
         </w:rPr>
         <w:t xml:space="preserve">TopoRadar-Net schematic. Bitemporal SAR differences query pooled topographic keys and values; a pixelwise terrain gate conditions decoding. The training schematic omits the ground-truth loss input for clarity</w:t>
@@ -2843,7 +2847,7 @@
           <w:rFonts w:ascii="Times New Roman" w:hAnsi="Times New Roman" w:eastAsia="Times New Roman"/>
           <w:sz w:val="24"/>
         </w:rPr>
-        <w:t xml:space="preserve">The objective combines positive-weighted binary cross-entropy, Dice loss, and a soft slope prior:</w:t>
+        <w:t xml:space="preserve">The objective combines positive-weighted binary cross-entropy (BCE), Dice loss, and a soft slope prior:</w:t>
       </w:r>
     </w:p>
     <w:p>
@@ -3249,7 +3253,58 @@
           <w:rFonts w:ascii="Times New Roman" w:hAnsi="Times New Roman" w:eastAsia="Times New Roman"/>
           <w:sz w:val="24"/>
         </w:rPr>
-        <w:t xml:space="preserve">. This retrospective proxy excludes data acquisition, human review, dispatch, and closure decisions.</w:t>
+        <w:t xml:space="preserve">. This retrospective proxy excludes data acquisition, human review, dispatch, and closure decisions. Figures </w:t>
+      </w:r>
+      <w:hyperlink w:anchor="fig:architecture">
+        <w:r>
+          <w:rPr>
+            <w:rStyle w:val="Hyperlink"/>
+          </w:rPr>
+          <w:t xml:space="preserve">1</w:t>
+        </w:r>
+      </w:hyperlink>
+      <w:r>
+        <w:rPr>
+          <w:rFonts w:ascii="Times New Roman" w:hAnsi="Times New Roman" w:eastAsia="Times New Roman"/>
+          <w:sz w:val="24"/>
+        </w:rPr>
+        <w:t xml:space="preserve"> </w:t>
+      </w:r>
+      <w:r>
+        <w:rPr>
+          <w:rFonts w:ascii="Times New Roman" w:hAnsi="Times New Roman" w:eastAsia="Times New Roman"/>
+          <w:sz w:val="24"/>
+        </w:rPr>
+        <w:t xml:space="preserve">and</w:t>
+      </w:r>
+      <w:r>
+        <w:rPr>
+          <w:rFonts w:ascii="Times New Roman" w:hAnsi="Times New Roman" w:eastAsia="Times New Roman"/>
+          <w:sz w:val="24"/>
+        </w:rPr>
+        <w:t xml:space="preserve"> </w:t>
+      </w:r>
+      <w:hyperlink w:anchor="fig:performance">
+        <w:r>
+          <w:rPr>
+            <w:rStyle w:val="Hyperlink"/>
+          </w:rPr>
+          <w:t xml:space="preserve">2</w:t>
+        </w:r>
+      </w:hyperlink>
+      <w:r>
+        <w:rPr>
+          <w:rFonts w:ascii="Times New Roman" w:hAnsi="Times New Roman" w:eastAsia="Times New Roman"/>
+          <w:sz w:val="24"/>
+        </w:rPr>
+        <w:t xml:space="preserve"> </w:t>
+      </w:r>
+      <w:r>
+        <w:rPr>
+          <w:rFonts w:ascii="Times New Roman" w:hAnsi="Times New Roman" w:eastAsia="Times New Roman"/>
+          <w:sz w:val="24"/>
+        </w:rPr>
+        <w:t xml:space="preserve">were generated with Python 3.14.7 and Matplotlib 3.11.2.</w:t>
       </w:r>
     </w:p>
     <w:bookmarkEnd w:id="17"/>
@@ -3689,7 +3744,7 @@
           <w:rFonts w:ascii="Times New Roman" w:hAnsi="Times New Roman" w:eastAsia="Times New Roman"/>
           <w:sz w:val="24"/>
         </w:rPr>
-        <w:t xml:space="preserve">percentage points (95% CI</w:t>
+        <w:t xml:space="preserve">percentage points (95% confidence interval [CI]</w:t>
       </w:r>
       <w:r>
         <w:rPr>
@@ -3809,6 +3864,7 @@
         <w:rPr>
           <w:rFonts w:ascii="Times New Roman" w:hAnsi="Times New Roman" w:eastAsia="Times New Roman"/>
           <w:b/>
+          <w:i w:val="0"/>
           <w:sz w:val="24"/>
         </w:rPr>
         <w:t xml:space="preserve">Table 2. </w:t>
@@ -3816,6 +3872,7 @@
       <w:r>
         <w:rPr>
           <w:rFonts w:ascii="Times New Roman" w:hAnsi="Times New Roman" w:eastAsia="Times New Roman"/>
+          <w:i w:val="0"/>
           <w:sz w:val="24"/>
         </w:rPr>
         <w:t xml:space="preserve">Zero-shot test performance across three fixed training seeds (mean</w:t>
@@ -3823,6 +3880,7 @@
       <w:r>
         <w:rPr>
           <w:rFonts w:ascii="Times New Roman" w:hAnsi="Times New Roman" w:eastAsia="Times New Roman"/>
+          <w:i w:val="0"/>
           <w:sz w:val="24"/>
         </w:rPr>
         <w:t xml:space="preserve"> </w:t>
@@ -3838,13 +3896,15 @@
       <w:r>
         <w:rPr>
           <w:rFonts w:ascii="Times New Roman" w:hAnsi="Times New Roman" w:eastAsia="Times New Roman"/>
-          <w:sz w:val="24"/>
-        </w:rPr>
-        <w:t xml:space="preserve"> </w:t>
-      </w:r>
-      <w:r>
-        <w:rPr>
-          <w:rFonts w:ascii="Times New Roman" w:hAnsi="Times New Roman" w:eastAsia="Times New Roman"/>
+          <w:i w:val="0"/>
+          <w:sz w:val="24"/>
+        </w:rPr>
+        <w:t xml:space="preserve"> </w:t>
+      </w:r>
+      <w:r>
+        <w:rPr>
+          <w:rFonts w:ascii="Times New Roman" w:hAnsi="Times New Roman" w:eastAsia="Times New Roman"/>
+          <w:i w:val="0"/>
           <w:sz w:val="24"/>
         </w:rPr>
         <w:t xml:space="preserve">descriptive population standard deviation). HR is polygon hit rate at</w:t>
@@ -3852,6 +3912,7 @@
       <w:r>
         <w:rPr>
           <w:rFonts w:ascii="Times New Roman" w:hAnsi="Times New Roman" w:eastAsia="Times New Roman"/>
+          <w:i w:val="0"/>
           <w:sz w:val="24"/>
         </w:rPr>
         <w:t xml:space="preserve"> </w:t>
@@ -3870,13 +3931,15 @@
       <w:r>
         <w:rPr>
           <w:rFonts w:ascii="Times New Roman" w:hAnsi="Times New Roman" w:eastAsia="Times New Roman"/>
-          <w:sz w:val="24"/>
-        </w:rPr>
-        <w:t xml:space="preserve"> </w:t>
-      </w:r>
-      <w:r>
-        <w:rPr>
-          <w:rFonts w:ascii="Times New Roman" w:hAnsi="Times New Roman" w:eastAsia="Times New Roman"/>
+          <w:i w:val="0"/>
+          <w:sz w:val="24"/>
+        </w:rPr>
+        <w:t xml:space="preserve"> </w:t>
+      </w:r>
+      <w:r>
+        <w:rPr>
+          <w:rFonts w:ascii="Times New Roman" w:hAnsi="Times New Roman" w:eastAsia="Times New Roman"/>
+          <w:i w:val="0"/>
           <w:sz w:val="24"/>
         </w:rPr>
         <w:t xml:space="preserve">overlap</w:t>
@@ -4885,13 +4948,15 @@
         <w:rPr>
           <w:rFonts w:ascii="Times New Roman" w:hAnsi="Times New Roman" w:eastAsia="Times New Roman"/>
           <w:b/>
-          <w:sz w:val="24"/>
-        </w:rPr>
-        <w:t xml:space="preserve">Fig. 2. </w:t>
-      </w:r>
-      <w:r>
-        <w:rPr>
-          <w:rFonts w:ascii="Times New Roman" w:hAnsi="Times New Roman" w:eastAsia="Times New Roman"/>
+          <w:i w:val="0"/>
+          <w:sz w:val="24"/>
+        </w:rPr>
+        <w:t xml:space="preserve">Fig. 2 </w:t>
+      </w:r>
+      <w:r>
+        <w:rPr>
+          <w:rFonts w:ascii="Times New Roman" w:hAnsi="Times New Roman" w:eastAsia="Times New Roman"/>
+          <w:i w:val="0"/>
           <w:sz w:val="24"/>
         </w:rPr>
         <w:t xml:space="preserve">Zero-shot pixel F1 across held-out Troms</w:t>
@@ -4899,6 +4964,7 @@
       <w:r>
         <w:rPr>
           <w:rFonts w:ascii="Times New Roman" w:hAnsi="Times New Roman" w:eastAsia="Times New Roman"/>
+          <w:i w:val="0"/>
           <w:sz w:val="24"/>
         </w:rPr>
         <w:t xml:space="preserve">ø</w:t>
@@ -4906,6 +4972,7 @@
       <w:r>
         <w:rPr>
           <w:rFonts w:ascii="Times New Roman" w:hAnsi="Times New Roman" w:eastAsia="Times New Roman"/>
+          <w:i w:val="0"/>
           <w:sz w:val="24"/>
         </w:rPr>
         <w:t xml:space="preserve">, Pish, and their macro average. Error bars show descriptive population standard deviation over three fixed training seeds</w:t>
@@ -5210,6 +5277,7 @@
         <w:rPr>
           <w:rFonts w:ascii="Times New Roman" w:hAnsi="Times New Roman" w:eastAsia="Times New Roman"/>
           <w:b/>
+          <w:i w:val="0"/>
           <w:sz w:val="24"/>
         </w:rPr>
         <w:t xml:space="preserve">Table 3. </w:t>
@@ -5217,6 +5285,7 @@
       <w:r>
         <w:rPr>
           <w:rFonts w:ascii="Times New Roman" w:hAnsi="Times New Roman" w:eastAsia="Times New Roman"/>
+          <w:i w:val="0"/>
           <w:sz w:val="24"/>
         </w:rPr>
         <w:t xml:space="preserve">Ablation performance across three seeds. The highest pooled value is obtained without aspect and its fixed-reference coordinate</w:t>
@@ -6412,7 +6481,7 @@
           <w:rFonts w:ascii="Times New Roman" w:hAnsi="Times New Roman" w:eastAsia="Times New Roman"/>
           <w:sz w:val="24"/>
         </w:rPr>
-        <w:t>The affine valid-mask area is 196.820 km² in Tromsø and 267.435 km² in Pish. In Tromsø, TopoRadar-Net produces 74.77 ha of false positives at 0.38 ha km⁻². In Pish, it produces 129.69 ha at 0.48 ha km⁻². Relative to the self-attention U-Net, this is a 30.0% reduction in Pish (129.69 versus 185.32 ha) but a 28.5% increase in Tromsø (74.77 versus 58.19 ha). Validation-calibrated road-corridor alerts achieve 83.0% precision and 62.5% recall in Pish. The single road-intersecting reference avalanche in Tromsø is missed by every TopoRadar-Net seed. All cached complete-scene runs are below 5 s on Apple MPS hardware, but timing excludes upstream acquisition and human review.</w:t>
+        <w:t>The affine valid-mask area is 196.820 km² in Tromsø and 267.435 km² in Pish. In Tromsø, TopoRadar-Net produces 74.77 ha of false positives at 0.38 ha km⁻². In Pish, it produces 129.69 ha at 0.48 ha km⁻². Relative to the self-attention U-Net, this is a 30.0% reduction in Pish (129.69 versus 185.32 ha) but a 28.5% increase in Tromsø (74.77 versus 58.19 ha). Validation-calibrated road-corridor alerts achieve 83.0% precision and 62.5% recall in Pish. The single road-intersecting reference avalanche in Tromsø is missed by every TopoRadar-Net seed. All cached complete-scene runs are below 5 s on Apple Metal Performance Shaders (MPS) hardware, but timing excludes upstream acquisition and human review.</w:t>
       </w:r>
     </w:p>
     <w:bookmarkEnd w:id="28"/>
@@ -6716,7 +6785,37 @@
           <w:rFonts w:ascii="Times New Roman" w:hAnsi="Times New Roman" w:eastAsia="Times New Roman"/>
           <w:sz w:val="24"/>
         </w:rPr>
-        <w:t xml:space="preserve">. Online Resource 1 contains extended methods, complete statistical and subgroup results, and reproducibility identifiers. Code and checkpoint files are publicly archived; the identifying repository URL is withheld from the anonymous manuscript and supplied separately to the editorial office for double-blind review.</w:t>
+        <w:t xml:space="preserve">.</w:t>
+      </w:r>
+      <w:r>
+        <w:rPr>
+          <w:rFonts w:ascii="Times New Roman" w:hAnsi="Times New Roman" w:eastAsia="Times New Roman"/>
+          <w:sz w:val="24"/>
+        </w:rPr>
+        <w:t xml:space="preserve"> </w:t>
+      </w:r>
+      <w:r>
+        <w:rPr>
+          <w:rFonts w:ascii="Times New Roman" w:hAnsi="Times New Roman" w:eastAsia="Times New Roman"/>
+          <w:b/>
+          <w:bCs/>
+          <w:sz w:val="24"/>
+        </w:rPr>
+        <w:t xml:space="preserve">Online Resource 1.</w:t>
+      </w:r>
+      <w:r>
+        <w:rPr>
+          <w:rFonts w:ascii="Times New Roman" w:hAnsi="Times New Roman" w:eastAsia="Times New Roman"/>
+          <w:sz w:val="24"/>
+        </w:rPr>
+        <w:t xml:space="preserve"> </w:t>
+      </w:r>
+      <w:r>
+        <w:rPr>
+          <w:rFonts w:ascii="Times New Roman" w:hAnsi="Times New Roman" w:eastAsia="Times New Roman"/>
+          <w:sz w:val="24"/>
+        </w:rPr>
+        <w:t xml:space="preserve">Extended methods, complete statistical and subgroup results, and reproducibility identifiers. Code and checkpoint files are publicly archived; the identifying repository URL is withheld from the anonymous manuscript and supplied separately to the editorial office for double-blind review.</w:t>
       </w:r>
     </w:p>
     <w:bookmarkEnd w:id="33"/>
@@ -8382,12 +8481,12 @@
     <w:bookmarkEnd w:id="67"/>
     <w:bookmarkEnd w:id="68"/>
     <w:sectPr>
+      <w:footerReference w:type="default" r:id="rId9"/>
       <w:footnotePr>
         <w:numRestart w:val="eachSect"/>
       </w:footnotePr>
       <w:pgSz w:w="11906" w:h="16838"/>
       <w:pgMar w:top="1134" w:bottom="1134" w:left="1134" w:right="1134"/>
-      <w:lnNumType w:countBy="1" w:start="1" w:restart="continuous"/>
     </w:sectPr>
   </w:body>
 </w:document>
@@ -8395,6 +8494,28 @@
 
 <file path=word/comments.xml><?xml version="1.0" encoding="utf-8"?>
 <w:comments xmlns:w="http://schemas.openxmlformats.org/wordprocessingml/2006/main" xmlns:m="http://schemas.openxmlformats.org/officeDocument/2006/math" xmlns:r="http://schemas.openxmlformats.org/officeDocument/2006/relationships" xmlns:o="urn:schemas-microsoft-com:office:office" xmlns:v="urn:schemas-microsoft-com:vml" xmlns:w10="urn:schemas-microsoft-com:office:word" xmlns:a="http://schemas.openxmlformats.org/drawingml/2006/main" xmlns:pic="http://schemas.openxmlformats.org/drawingml/2006/picture" xmlns:wp="http://schemas.openxmlformats.org/drawingml/2006/wordprocessingDrawing"/>
+</file>
+
+<file path=word/footer1.xml><?xml version="1.0" encoding="utf-8"?>
+<w:ftr xmlns:m="http://schemas.openxmlformats.org/officeDocument/2006/math" xmlns:mc="http://schemas.openxmlformats.org/markup-compatibility/2006" xmlns:mo="http://schemas.microsoft.com/office/mac/office/2008/main" xmlns:mv="urn:schemas-microsoft-com:mac:vml" xmlns:o="urn:schemas-microsoft-com:office:office" xmlns:r="http://schemas.openxmlformats.org/officeDocument/2006/relationships" xmlns:v="urn:schemas-microsoft-com:vml" xmlns:w10="urn:schemas-microsoft-com:office:word" xmlns:w14="http://schemas.microsoft.com/office/word/2010/wordml" xmlns:w="http://schemas.openxmlformats.org/wordprocessingml/2006/main" xmlns:wne="http://schemas.microsoft.com/office/word/2006/wordml" xmlns:wp14="http://schemas.microsoft.com/office/word/2010/wordprocessingDrawing" xmlns:wp="http://schemas.openxmlformats.org/drawingml/2006/wordprocessingDrawing" xmlns:wpc="http://schemas.microsoft.com/office/word/2010/wordprocessingCanvas" xmlns:wpg="http://schemas.microsoft.com/office/word/2010/wordprocessingGroup" xmlns:wpi="http://schemas.microsoft.com/office/word/2010/wordprocessingInk" xmlns:wps="http://schemas.microsoft.com/office/word/2010/wordprocessingShape" mc:Ignorable="w14 wp14">
+  <w:p>
+    <w:pPr>
+      <w:pStyle w:val="Footer"/>
+      <w:jc w:val="center"/>
+    </w:pPr>
+    <w:r>
+      <w:rPr>
+        <w:rFonts w:ascii="Times New Roman" w:hAnsi="Times New Roman" w:eastAsia="Times New Roman"/>
+        <w:sz w:val="20"/>
+      </w:rPr>
+      <w:fldChar w:fldCharType="begin"/>
+      <w:instrText xml:space="preserve"> PAGE </w:instrText>
+      <w:fldChar w:fldCharType="separate"/>
+      <w:t>1</w:t>
+      <w:fldChar w:fldCharType="end"/>
+    </w:r>
+  </w:p>
+</w:ftr>
 </file>
 
 <file path=word/footnotes.xml><?xml version="1.0" encoding="utf-8"?>

</xml_diff>

<commit_message>
release: close Cycle 07 reproducibility findings
</commit_message>
<xml_diff>
--- a/submission-jisrs/JISRS_Main_Manuscript_Anonymous.docx
+++ b/submission-jisrs/JISRS_Main_Manuscript_Anonymous.docx
@@ -324,7 +324,35 @@
           <w:rFonts w:ascii="Times New Roman" w:hAnsi="Times New Roman" w:eastAsia="Times New Roman"/>
           <w:sz w:val="24"/>
         </w:rPr>
-        <w:t xml:space="preserve">encode local incidence angle and slope in a separate transformer branch and report that SAR-only change detection is more consistent than terrain-augmented variants. Our architectural delta is narrower: SAR-change queries attend to pooled terrain keys and values, including a fixed</w:t>
+        <w:t xml:space="preserve">encode local incidence angle and slope in a separate transformer branch and report that SAR-only change detection is more consistent than terrain-augmented variants. Concurrently,</w:t>
+      </w:r>
+      <w:r>
+        <w:rPr>
+          <w:rFonts w:ascii="Times New Roman" w:hAnsi="Times New Roman" w:eastAsia="Times New Roman"/>
+          <w:sz w:val="24"/>
+        </w:rPr>
+        <w:t xml:space="preserve"> </w:t>
+      </w:r>
+      <w:r>
+        <w:rPr>
+          <w:rFonts w:ascii="Times New Roman" w:hAnsi="Times New Roman" w:eastAsia="Times New Roman"/>
+          <w:sz w:val="24"/>
+        </w:rPr>
+        <w:t xml:space="preserve">Gelato et al. (2026)</w:t>
+      </w:r>
+      <w:r>
+        <w:rPr>
+          <w:rFonts w:ascii="Times New Roman" w:hAnsi="Times New Roman" w:eastAsia="Times New Roman"/>
+          <w:sz w:val="24"/>
+        </w:rPr>
+        <w:t xml:space="preserve"> </w:t>
+      </w:r>
+      <w:r>
+        <w:rPr>
+          <w:rFonts w:ascii="Times New Roman" w:hAnsi="Times New Roman" w:eastAsia="Times New Roman"/>
+          <w:sz w:val="24"/>
+        </w:rPr>
+        <w:t xml:space="preserve">adapt a promptable foundation model to SAR avalanche segmentation using SAR, elevation, and slope inputs and evaluate annotation-time reduction. Our target instead is autonomous bitemporal change segmentation across held-out regions, with multi-seed failure characterization rather than prompt-driven annotation. Our architectural delta is narrower: SAR-change queries attend to pooled terrain keys and values, including a fixed</w:t>
       </w:r>
       <w:r>
         <w:rPr>
@@ -6481,7 +6509,7 @@
           <w:rFonts w:ascii="Times New Roman" w:hAnsi="Times New Roman" w:eastAsia="Times New Roman"/>
           <w:sz w:val="24"/>
         </w:rPr>
-        <w:t>The affine valid-mask area is 196.820 km² in Tromsø and 267.435 km² in Pish. In Tromsø, TopoRadar-Net produces 74.77 ha of false positives at 0.38 ha km⁻². In Pish, it produces 129.69 ha at 0.48 ha km⁻². Relative to the self-attention U-Net, this is a 30.0% reduction in Pish (129.69 versus 185.32 ha) but a 28.5% increase in Tromsø (74.77 versus 58.19 ha). Validation-calibrated road-corridor alerts achieve 83.0% precision and 62.5% recall in Pish. The single road-intersecting reference avalanche in Tromsø is missed by every TopoRadar-Net seed. All cached complete-scene runs are below 5 s on Apple Metal Performance Shaders (MPS) hardware, but timing excludes upstream acquisition and human review.</w:t>
+        <w:t>The affine valid-mask area is 196.820 km² in Tromsø and 267.435 km² in Pish. In Tromsø, TopoRadar-Net produces 74.77 ha of false positives at 0.38 ha km⁻². In Pish, it produces 129.69 ha at 0.48 ha km⁻². Relative to the self-attention U-Net, this is a 30.0% reduction in Pish (129.69 versus 185.32 ha) but a 28.5% increase in Tromsø (74.77 versus 58.19 ha). Validation-calibrated road-corridor alerts achieve 83.0% precision and 62.5% recall in Pish. The single road-intersecting reference avalanche in Tromsø is missed by every TopoRadar-Net seed. All cached complete-scene runs are below 5 s on Apple Metal Performance Shaders hardware, but timing excludes upstream acquisition and human review.</w:t>
       </w:r>
     </w:p>
     <w:bookmarkEnd w:id="28"/>
@@ -6819,7 +6847,7 @@
       </w:r>
     </w:p>
     <w:bookmarkEnd w:id="33"/>
-    <w:bookmarkStart w:id="68" w:name="statements-and-declarations"/>
+    <w:bookmarkStart w:id="70" w:name="statements-and-declarations"/>
     <w:p>
       <w:pPr>
         <w:pStyle w:val="Heading1"/>
@@ -7007,7 +7035,7 @@
         <w:t xml:space="preserve">Generative AI assistance is documented in the Methods section. The authors retain responsibility for all code, analyses, citations, and text.</w:t>
       </w:r>
     </w:p>
-    <w:bookmarkStart w:id="67" w:name="refs"/>
+    <w:bookmarkStart w:id="69" w:name="refs"/>
     <w:bookmarkStart w:id="35" w:name="ref-ahmad2026avalanche"/>
     <w:p>
       <w:pPr>
@@ -8088,7 +8116,7 @@
       </w:hyperlink>
     </w:p>
     <w:bookmarkEnd w:id="56"/>
-    <w:bookmarkStart w:id="58" w:name="ref-nguyen2025landslide"/>
+    <w:bookmarkStart w:id="58" w:name="ref-gelato2026promptable"/>
     <w:p>
       <w:pPr>
         <w:pStyle w:val="Bibliography"/>
@@ -8099,7 +8127,35 @@
           <w:rFonts w:ascii="Times New Roman" w:hAnsi="Times New Roman" w:eastAsia="Times New Roman"/>
           <w:sz w:val="24"/>
         </w:rPr>
-        <w:t xml:space="preserve">Nguyen, H., Dang, K. B., Giang, T. L., Dang, V. B., Dang, N. V., &amp; Dao, M. D. (2025).</w:t>
+        <w:t xml:space="preserve">Gelato, R., Sgaravatti, C., Grahn, J., Boracchi, G., &amp; Bianchi, F. M. (2026). Promptable foundation models for</w:t>
+      </w:r>
+      <w:r>
+        <w:rPr>
+          <w:rFonts w:ascii="Times New Roman" w:hAnsi="Times New Roman" w:eastAsia="Times New Roman"/>
+          <w:sz w:val="24"/>
+        </w:rPr>
+        <w:t xml:space="preserve"> </w:t>
+      </w:r>
+      <w:r>
+        <w:rPr>
+          <w:rFonts w:ascii="Times New Roman" w:hAnsi="Times New Roman" w:eastAsia="Times New Roman"/>
+          <w:sz w:val="24"/>
+        </w:rPr>
+        <w:t xml:space="preserve">SAR</w:t>
+      </w:r>
+      <w:r>
+        <w:rPr>
+          <w:rFonts w:ascii="Times New Roman" w:hAnsi="Times New Roman" w:eastAsia="Times New Roman"/>
+          <w:sz w:val="24"/>
+        </w:rPr>
+        <w:t xml:space="preserve"> </w:t>
+      </w:r>
+      <w:r>
+        <w:rPr>
+          <w:rFonts w:ascii="Times New Roman" w:hAnsi="Times New Roman" w:eastAsia="Times New Roman"/>
+          <w:sz w:val="24"/>
+        </w:rPr>
+        <w:t xml:space="preserve">remote sensing: Adapting the segment anything model for snow avalanche segmentation.</w:t>
       </w:r>
       <w:r>
         <w:rPr>
@@ -8115,6 +8171,82 @@
           <w:iCs/>
           <w:sz w:val="24"/>
         </w:rPr>
+        <w:t xml:space="preserve">Remote Sensing</w:t>
+      </w:r>
+      <w:r>
+        <w:rPr>
+          <w:rFonts w:ascii="Times New Roman" w:hAnsi="Times New Roman" w:eastAsia="Times New Roman"/>
+          <w:sz w:val="24"/>
+        </w:rPr>
+        <w:t xml:space="preserve">,</w:t>
+      </w:r>
+      <w:r>
+        <w:rPr>
+          <w:rFonts w:ascii="Times New Roman" w:hAnsi="Times New Roman" w:eastAsia="Times New Roman"/>
+          <w:sz w:val="24"/>
+        </w:rPr>
+        <w:t xml:space="preserve"> </w:t>
+      </w:r>
+      <w:r>
+        <w:rPr>
+          <w:rFonts w:ascii="Times New Roman" w:hAnsi="Times New Roman" w:eastAsia="Times New Roman"/>
+          <w:i/>
+          <w:iCs/>
+          <w:sz w:val="24"/>
+        </w:rPr>
+        <w:t xml:space="preserve">18</w:t>
+      </w:r>
+      <w:r>
+        <w:rPr>
+          <w:rFonts w:ascii="Times New Roman" w:hAnsi="Times New Roman" w:eastAsia="Times New Roman"/>
+          <w:sz w:val="24"/>
+        </w:rPr>
+        <w:t xml:space="preserve">(3), 519.</w:t>
+      </w:r>
+      <w:r>
+        <w:rPr>
+          <w:rFonts w:ascii="Times New Roman" w:hAnsi="Times New Roman" w:eastAsia="Times New Roman"/>
+          <w:sz w:val="24"/>
+        </w:rPr>
+        <w:t xml:space="preserve"> </w:t>
+      </w:r>
+      <w:hyperlink r:id="rId57">
+        <w:r>
+          <w:rPr>
+            <w:rStyle w:val="Hyperlink"/>
+          </w:rPr>
+          <w:t xml:space="preserve">https://doi.org/10.3390/rs18030519</w:t>
+        </w:r>
+      </w:hyperlink>
+    </w:p>
+    <w:bookmarkEnd w:id="58"/>
+    <w:bookmarkStart w:id="60" w:name="ref-nguyen2025landslide"/>
+    <w:p>
+      <w:pPr>
+        <w:pStyle w:val="Bibliography"/>
+        <w:spacing w:line="480" w:lineRule="auto" w:after="0"/>
+      </w:pPr>
+      <w:r>
+        <w:rPr>
+          <w:rFonts w:ascii="Times New Roman" w:hAnsi="Times New Roman" w:eastAsia="Times New Roman"/>
+          <w:sz w:val="24"/>
+        </w:rPr>
+        <w:t xml:space="preserve">Nguyen, H., Dang, K. B., Giang, T. L., Dang, V. B., Dang, N. V., &amp; Dao, M. D. (2025).</w:t>
+      </w:r>
+      <w:r>
+        <w:rPr>
+          <w:rFonts w:ascii="Times New Roman" w:hAnsi="Times New Roman" w:eastAsia="Times New Roman"/>
+          <w:sz w:val="24"/>
+        </w:rPr>
+        <w:t xml:space="preserve"> </w:t>
+      </w:r>
+      <w:r>
+        <w:rPr>
+          <w:rFonts w:ascii="Times New Roman" w:hAnsi="Times New Roman" w:eastAsia="Times New Roman"/>
+          <w:i/>
+          <w:iCs/>
+          <w:sz w:val="24"/>
+        </w:rPr>
         <w:t xml:space="preserve">Exploring various deep learning models for high-precision landslide tracing in very-high resolution remote sensing imagery</w:t>
       </w:r>
       <w:r>
@@ -8131,7 +8263,7 @@
         </w:rPr>
         <w:t xml:space="preserve"> </w:t>
       </w:r>
-      <w:hyperlink r:id="rId57">
+      <w:hyperlink r:id="rId59">
         <w:r>
           <w:rPr>
             <w:rStyle w:val="Hyperlink"/>
@@ -8140,8 +8272,8 @@
         </w:r>
       </w:hyperlink>
     </w:p>
-    <w:bookmarkEnd w:id="58"/>
-    <w:bookmarkStart w:id="60" w:name="ref-openstreetmap2026"/>
+    <w:bookmarkEnd w:id="60"/>
+    <w:bookmarkStart w:id="62" w:name="ref-openstreetmap2026"/>
     <w:p>
       <w:pPr>
         <w:pStyle w:val="Bibliography"/>
@@ -8184,7 +8316,7 @@
         </w:rPr>
         <w:t xml:space="preserve"> </w:t>
       </w:r>
-      <w:hyperlink r:id="rId59">
+      <w:hyperlink r:id="rId61">
         <w:r>
           <w:rPr>
             <w:rStyle w:val="Hyperlink"/>
@@ -8200,8 +8332,8 @@
         <w:t xml:space="preserve">.</w:t>
       </w:r>
     </w:p>
-    <w:bookmarkEnd w:id="60"/>
-    <w:bookmarkStart w:id="62" w:name="ref-tompkin2021backscatter"/>
+    <w:bookmarkEnd w:id="62"/>
+    <w:bookmarkStart w:id="64" w:name="ref-tompkin2021backscatter"/>
     <w:p>
       <w:pPr>
         <w:pStyle w:val="Bibliography"/>
@@ -8267,7 +8399,7 @@
         </w:rPr>
         <w:t xml:space="preserve"> </w:t>
       </w:r>
-      <w:hyperlink r:id="rId61">
+      <w:hyperlink r:id="rId63">
         <w:r>
           <w:rPr>
             <w:rStyle w:val="Hyperlink"/>
@@ -8276,8 +8408,8 @@
         </w:r>
       </w:hyperlink>
     </w:p>
-    <w:bookmarkEnd w:id="62"/>
-    <w:bookmarkStart w:id="64" w:name="ref-wang2025change"/>
+    <w:bookmarkEnd w:id="64"/>
+    <w:bookmarkStart w:id="66" w:name="ref-wang2025change"/>
     <w:p>
       <w:pPr>
         <w:pStyle w:val="Bibliography"/>
@@ -8371,7 +8503,7 @@
         </w:rPr>
         <w:t xml:space="preserve"> </w:t>
       </w:r>
-      <w:hyperlink r:id="rId63">
+      <w:hyperlink r:id="rId65">
         <w:r>
           <w:rPr>
             <w:rStyle w:val="Hyperlink"/>
@@ -8380,8 +8512,8 @@
         </w:r>
       </w:hyperlink>
     </w:p>
-    <w:bookmarkEnd w:id="64"/>
-    <w:bookmarkStart w:id="66" w:name="ref-zhang2018road"/>
+    <w:bookmarkEnd w:id="66"/>
+    <w:bookmarkStart w:id="68" w:name="ref-zhang2018road"/>
     <w:p>
       <w:pPr>
         <w:pStyle w:val="Bibliography"/>
@@ -8468,7 +8600,7 @@
         </w:rPr>
         <w:t xml:space="preserve"> </w:t>
       </w:r>
-      <w:hyperlink r:id="rId65">
+      <w:hyperlink r:id="rId67">
         <w:r>
           <w:rPr>
             <w:rStyle w:val="Hyperlink"/>
@@ -8477,9 +8609,9 @@
         </w:r>
       </w:hyperlink>
     </w:p>
-    <w:bookmarkEnd w:id="66"/>
-    <w:bookmarkEnd w:id="67"/>
     <w:bookmarkEnd w:id="68"/>
+    <w:bookmarkEnd w:id="69"/>
+    <w:bookmarkEnd w:id="70"/>
     <w:sectPr>
       <w:footerReference w:type="default" r:id="rId9"/>
       <w:footnotePr>

</xml_diff>

<commit_message>
submission: publish JISRS editorial-return corrections
</commit_message>
<xml_diff>
--- a/submission-jisrs/JISRS_Main_Manuscript_Anonymous.docx
+++ b/submission-jisrs/JISRS_Main_Manuscript_Anonymous.docx
@@ -6767,7 +6767,7 @@
       </w:r>
     </w:p>
     <w:bookmarkEnd w:id="31"/>
-    <w:bookmarkStart w:id="33" w:name="Xa289a65e6ec38d749b9a3a048b9f8b122819b0a"/>
+    <w:bookmarkStart w:id="69" w:name="Xa289a65e6ec38d749b9a3a048b9f8b122819b0a"/>
     <w:p>
       <w:pPr>
         <w:pStyle w:val="Heading1"/>
@@ -6846,197 +6846,8 @@
         <w:t xml:space="preserve">Extended methods, complete statistical and subgroup results, and reproducibility identifiers. Code and checkpoint files are publicly archived; the identifying repository URL is withheld from the anonymous manuscript and supplied separately to the editorial office for double-blind review.</w:t>
       </w:r>
     </w:p>
-    <w:bookmarkEnd w:id="33"/>
-    <w:bookmarkStart w:id="70" w:name="statements-and-declarations"/>
-    <w:p>
-      <w:pPr>
-        <w:pStyle w:val="Heading1"/>
-        <w:spacing w:line="480" w:lineRule="auto" w:after="0"/>
-      </w:pPr>
-      <w:r>
-        <w:rPr>
-          <w:rFonts w:ascii="Times New Roman" w:hAnsi="Times New Roman" w:eastAsia="Times New Roman"/>
-          <w:sz w:val="24"/>
-        </w:rPr>
-        <w:t xml:space="preserve">Statements and Declarations</w:t>
-      </w:r>
-    </w:p>
-    <w:p>
-      <w:pPr>
-        <w:pStyle w:val="FirstParagraph"/>
-        <w:spacing w:line="480" w:lineRule="auto" w:after="0"/>
-      </w:pPr>
-      <w:r>
-        <w:rPr>
-          <w:rFonts w:ascii="Times New Roman" w:hAnsi="Times New Roman" w:eastAsia="Times New Roman"/>
-          <w:b/>
-          <w:bCs/>
-          <w:sz w:val="24"/>
-        </w:rPr>
-        <w:t xml:space="preserve">Funding.</w:t>
-      </w:r>
-      <w:r>
-        <w:rPr>
-          <w:rFonts w:ascii="Times New Roman" w:hAnsi="Times New Roman" w:eastAsia="Times New Roman"/>
-          <w:sz w:val="24"/>
-        </w:rPr>
-        <w:t xml:space="preserve"> </w:t>
-      </w:r>
-      <w:r>
-        <w:rPr>
-          <w:rFonts w:ascii="Times New Roman" w:hAnsi="Times New Roman" w:eastAsia="Times New Roman"/>
-          <w:sz w:val="24"/>
-        </w:rPr>
-        <w:t xml:space="preserve">No external grant funding was received for this study.</w:t>
-      </w:r>
-    </w:p>
-    <w:p>
-      <w:pPr>
-        <w:pStyle w:val="BodyText"/>
-        <w:spacing w:line="480" w:lineRule="auto" w:after="0"/>
-      </w:pPr>
-      <w:r>
-        <w:rPr>
-          <w:rFonts w:ascii="Times New Roman" w:hAnsi="Times New Roman" w:eastAsia="Times New Roman"/>
-          <w:b/>
-          <w:bCs/>
-          <w:sz w:val="24"/>
-        </w:rPr>
-        <w:t xml:space="preserve">Competing interests.</w:t>
-      </w:r>
-      <w:r>
-        <w:rPr>
-          <w:rFonts w:ascii="Times New Roman" w:hAnsi="Times New Roman" w:eastAsia="Times New Roman"/>
-          <w:sz w:val="24"/>
-        </w:rPr>
-        <w:t xml:space="preserve"> </w:t>
-      </w:r>
-      <w:r>
-        <w:rPr>
-          <w:rFonts w:ascii="Times New Roman" w:hAnsi="Times New Roman" w:eastAsia="Times New Roman"/>
-          <w:sz w:val="24"/>
-        </w:rPr>
-        <w:t xml:space="preserve">The authors declare no competing financial or non-financial interests.</w:t>
-      </w:r>
-    </w:p>
-    <w:p>
-      <w:pPr>
-        <w:pStyle w:val="BodyText"/>
-        <w:spacing w:line="480" w:lineRule="auto" w:after="0"/>
-      </w:pPr>
-      <w:r>
-        <w:rPr>
-          <w:rFonts w:ascii="Times New Roman" w:hAnsi="Times New Roman" w:eastAsia="Times New Roman"/>
-          <w:b/>
-          <w:bCs/>
-          <w:sz w:val="24"/>
-        </w:rPr>
-        <w:t xml:space="preserve">Ethics approval and consent.</w:t>
-      </w:r>
-      <w:r>
-        <w:rPr>
-          <w:rFonts w:ascii="Times New Roman" w:hAnsi="Times New Roman" w:eastAsia="Times New Roman"/>
-          <w:sz w:val="24"/>
-        </w:rPr>
-        <w:t xml:space="preserve"> </w:t>
-      </w:r>
-      <w:r>
-        <w:rPr>
-          <w:rFonts w:ascii="Times New Roman" w:hAnsi="Times New Roman" w:eastAsia="Times New Roman"/>
-          <w:sz w:val="24"/>
-        </w:rPr>
-        <w:t xml:space="preserve">Not applicable; the study uses public remote-sensing data and contains no human participants or animals.</w:t>
-      </w:r>
-    </w:p>
-    <w:p>
-      <w:pPr>
-        <w:pStyle w:val="BodyText"/>
-        <w:spacing w:line="480" w:lineRule="auto" w:after="0"/>
-      </w:pPr>
-      <w:r>
-        <w:rPr>
-          <w:rFonts w:ascii="Times New Roman" w:hAnsi="Times New Roman" w:eastAsia="Times New Roman"/>
-          <w:b/>
-          <w:bCs/>
-          <w:sz w:val="24"/>
-        </w:rPr>
-        <w:t xml:space="preserve">Consent for publication.</w:t>
-      </w:r>
-      <w:r>
-        <w:rPr>
-          <w:rFonts w:ascii="Times New Roman" w:hAnsi="Times New Roman" w:eastAsia="Times New Roman"/>
-          <w:sz w:val="24"/>
-        </w:rPr>
-        <w:t xml:space="preserve"> </w:t>
-      </w:r>
-      <w:r>
-        <w:rPr>
-          <w:rFonts w:ascii="Times New Roman" w:hAnsi="Times New Roman" w:eastAsia="Times New Roman"/>
-          <w:sz w:val="24"/>
-        </w:rPr>
-        <w:t xml:space="preserve">Not applicable.</w:t>
-      </w:r>
-    </w:p>
-    <w:p>
-      <w:pPr>
-        <w:pStyle w:val="BodyText"/>
-        <w:spacing w:line="480" w:lineRule="auto" w:after="0"/>
-      </w:pPr>
-      <w:r>
-        <w:rPr>
-          <w:rFonts w:ascii="Times New Roman" w:hAnsi="Times New Roman" w:eastAsia="Times New Roman"/>
-          <w:b/>
-          <w:bCs/>
-          <w:sz w:val="24"/>
-        </w:rPr>
-        <w:t xml:space="preserve">Author contributions.</w:t>
-      </w:r>
-      <w:r>
-        <w:rPr>
-          <w:rFonts w:ascii="Times New Roman" w:hAnsi="Times New Roman" w:eastAsia="Times New Roman"/>
-          <w:sz w:val="24"/>
-        </w:rPr>
-        <w:t xml:space="preserve"> </w:t>
-      </w:r>
-      <w:r>
-        <w:rPr>
-          <w:rFonts w:ascii="Times New Roman" w:hAnsi="Times New Roman" w:eastAsia="Times New Roman"/>
-          <w:sz w:val="24"/>
-        </w:rPr>
-        <w:t xml:space="preserve">The complete CRediT statement is provided on the separate title page.</w:t>
-      </w:r>
-    </w:p>
-    <w:p>
-      <w:pPr>
-        <w:pStyle w:val="BodyText"/>
-        <w:spacing w:line="480" w:lineRule="auto" w:after="0"/>
-      </w:pPr>
-      <w:r>
-        <w:rPr>
-          <w:rFonts w:ascii="Times New Roman" w:hAnsi="Times New Roman" w:eastAsia="Times New Roman"/>
-          <w:b/>
-          <w:bCs/>
-          <w:sz w:val="24"/>
-        </w:rPr>
-        <w:t xml:space="preserve">AI disclosure.</w:t>
-      </w:r>
-      <w:r>
-        <w:rPr>
-          <w:rFonts w:ascii="Times New Roman" w:hAnsi="Times New Roman" w:eastAsia="Times New Roman"/>
-          <w:sz w:val="24"/>
-        </w:rPr>
-        <w:t xml:space="preserve"> </w:t>
-      </w:r>
-      <w:r>
-        <w:rPr>
-          <w:rFonts w:ascii="Times New Roman" w:hAnsi="Times New Roman" w:eastAsia="Times New Roman"/>
-          <w:sz w:val="24"/>
-        </w:rPr>
-        <w:t xml:space="preserve">Generative AI assistance is documented in the Methods section. The authors retain responsibility for all code, analyses, citations, and text.</w:t>
-      </w:r>
-    </w:p>
-    <w:bookmarkStart w:id="69" w:name="refs"/>
-    <w:bookmarkStart w:id="35" w:name="ref-ahmad2026avalanche"/>
+    <w:bookmarkStart w:id="68" w:name="refs"/>
+    <w:bookmarkStart w:id="34" w:name="ref-ahmad2026avalanche"/>
     <w:p>
       <w:pPr>
         <w:pStyle w:val="Bibliography"/>
@@ -7102,7 +6913,7 @@
         </w:rPr>
         <w:t xml:space="preserve"> </w:t>
       </w:r>
-      <w:hyperlink r:id="rId34">
+      <w:hyperlink r:id="rId33">
         <w:r>
           <w:rPr>
             <w:rStyle w:val="Hyperlink"/>
@@ -7111,8 +6922,8 @@
         </w:r>
       </w:hyperlink>
     </w:p>
-    <w:bookmarkEnd w:id="35"/>
-    <w:bookmarkStart w:id="37" w:name="ref-arjasakusuma2024sar"/>
+    <w:bookmarkEnd w:id="34"/>
+    <w:bookmarkStart w:id="36" w:name="ref-arjasakusuma2024sar"/>
     <w:p>
       <w:pPr>
         <w:pStyle w:val="Bibliography"/>
@@ -7192,7 +7003,7 @@
         </w:rPr>
         <w:t xml:space="preserve"> </w:t>
       </w:r>
-      <w:hyperlink r:id="rId36">
+      <w:hyperlink r:id="rId35">
         <w:r>
           <w:rPr>
             <w:rStyle w:val="Hyperlink"/>
@@ -7201,8 +7012,8 @@
         </w:r>
       </w:hyperlink>
     </w:p>
-    <w:bookmarkEnd w:id="37"/>
-    <w:bookmarkStart w:id="39" w:name="ref-bayat2026debris"/>
+    <w:bookmarkEnd w:id="36"/>
+    <w:bookmarkStart w:id="38" w:name="ref-bayat2026debris"/>
     <w:p>
       <w:pPr>
         <w:pStyle w:val="Bibliography"/>
@@ -7268,7 +7079,7 @@
         </w:rPr>
         <w:t xml:space="preserve"> </w:t>
       </w:r>
-      <w:hyperlink r:id="rId38">
+      <w:hyperlink r:id="rId37">
         <w:r>
           <w:rPr>
             <w:rStyle w:val="Hyperlink"/>
@@ -7277,8 +7088,8 @@
         </w:r>
       </w:hyperlink>
     </w:p>
-    <w:bookmarkEnd w:id="39"/>
-    <w:bookmarkStart w:id="41" w:name="ref-bianchi2021snow"/>
+    <w:bookmarkEnd w:id="38"/>
+    <w:bookmarkStart w:id="40" w:name="ref-bianchi2021snow"/>
     <w:p>
       <w:pPr>
         <w:pStyle w:val="Bibliography"/>
@@ -7372,7 +7183,7 @@
         </w:rPr>
         <w:t xml:space="preserve"> </w:t>
       </w:r>
-      <w:hyperlink r:id="rId40">
+      <w:hyperlink r:id="rId39">
         <w:r>
           <w:rPr>
             <w:rStyle w:val="Hyperlink"/>
@@ -7381,8 +7192,8 @@
         </w:r>
       </w:hyperlink>
     </w:p>
-    <w:bookmarkEnd w:id="41"/>
-    <w:bookmarkStart w:id="43" w:name="ref-daudt2018fully"/>
+    <w:bookmarkEnd w:id="40"/>
+    <w:bookmarkStart w:id="42" w:name="ref-daudt2018fully"/>
     <w:p>
       <w:pPr>
         <w:pStyle w:val="Bibliography"/>
@@ -7425,7 +7236,7 @@
         </w:rPr>
         <w:t xml:space="preserve"> </w:t>
       </w:r>
-      <w:hyperlink r:id="rId42">
+      <w:hyperlink r:id="rId41">
         <w:r>
           <w:rPr>
             <w:rStyle w:val="Hyperlink"/>
@@ -7434,8 +7245,8 @@
         </w:r>
       </w:hyperlink>
     </w:p>
-    <w:bookmarkEnd w:id="43"/>
-    <w:bookmarkStart w:id="45" w:name="ref-chandra2025landslide"/>
+    <w:bookmarkEnd w:id="42"/>
+    <w:bookmarkStart w:id="44" w:name="ref-chandra2025landslide"/>
     <w:p>
       <w:pPr>
         <w:pStyle w:val="Bibliography"/>
@@ -7496,7 +7307,7 @@
         </w:rPr>
         <w:t xml:space="preserve"> </w:t>
       </w:r>
-      <w:hyperlink r:id="rId44">
+      <w:hyperlink r:id="rId43">
         <w:r>
           <w:rPr>
             <w:rStyle w:val="Hyperlink"/>
@@ -7505,8 +7316,8 @@
         </w:r>
       </w:hyperlink>
     </w:p>
-    <w:bookmarkEnd w:id="45"/>
-    <w:bookmarkStart w:id="47" w:name="ref-eckerstorfer2017remote"/>
+    <w:bookmarkEnd w:id="44"/>
+    <w:bookmarkStart w:id="46" w:name="ref-eckerstorfer2017remote"/>
     <w:p>
       <w:pPr>
         <w:pStyle w:val="Bibliography"/>
@@ -7600,7 +7411,7 @@
         </w:rPr>
         <w:t xml:space="preserve"> </w:t>
       </w:r>
-      <w:hyperlink r:id="rId46">
+      <w:hyperlink r:id="rId45">
         <w:r>
           <w:rPr>
             <w:rStyle w:val="Hyperlink"/>
@@ -7609,8 +7420,8 @@
         </w:r>
       </w:hyperlink>
     </w:p>
-    <w:bookmarkEnd w:id="47"/>
-    <w:bookmarkStart w:id="49" w:name="ref-muller2021synthetic"/>
+    <w:bookmarkEnd w:id="46"/>
+    <w:bookmarkStart w:id="48" w:name="ref-muller2021synthetic"/>
     <w:p>
       <w:pPr>
         <w:pStyle w:val="Bibliography"/>
@@ -7695,7 +7506,7 @@
         </w:rPr>
         <w:t xml:space="preserve"> </w:t>
       </w:r>
-      <w:hyperlink r:id="rId48">
+      <w:hyperlink r:id="rId47">
         <w:r>
           <w:rPr>
             <w:rStyle w:val="Hyperlink"/>
@@ -7704,8 +7515,8 @@
         </w:r>
       </w:hyperlink>
     </w:p>
-    <w:bookmarkEnd w:id="49"/>
-    <w:bookmarkStart w:id="51" w:name="ref-eckerstorfer2019near"/>
+    <w:bookmarkEnd w:id="48"/>
+    <w:bookmarkStart w:id="50" w:name="ref-eckerstorfer2019near"/>
     <w:p>
       <w:pPr>
         <w:pStyle w:val="Bibliography"/>
@@ -7834,7 +7645,7 @@
         </w:rPr>
         <w:t xml:space="preserve"> </w:t>
       </w:r>
-      <w:hyperlink r:id="rId50">
+      <w:hyperlink r:id="rId49">
         <w:r>
           <w:rPr>
             <w:rStyle w:val="Hyperlink"/>
@@ -7843,8 +7654,8 @@
         </w:r>
       </w:hyperlink>
     </w:p>
-    <w:bookmarkEnd w:id="51"/>
-    <w:bookmarkStart w:id="53" w:name="ref-eaws2022size"/>
+    <w:bookmarkEnd w:id="50"/>
+    <w:bookmarkStart w:id="52" w:name="ref-eaws2022size"/>
     <w:p>
       <w:pPr>
         <w:pStyle w:val="Bibliography"/>
@@ -7950,7 +7761,7 @@
         </w:rPr>
         <w:t xml:space="preserve"> </w:t>
       </w:r>
-      <w:hyperlink r:id="rId52">
+      <w:hyperlink r:id="rId51">
         <w:r>
           <w:rPr>
             <w:rStyle w:val="Hyperlink"/>
@@ -7966,8 +7777,8 @@
         <w:t xml:space="preserve">.</w:t>
       </w:r>
     </w:p>
-    <w:bookmarkEnd w:id="53"/>
-    <w:bookmarkStart w:id="54" w:name="ref-avalcd_dataset"/>
+    <w:bookmarkEnd w:id="52"/>
+    <w:bookmarkStart w:id="53" w:name="ref-avalcd_dataset"/>
     <w:p>
       <w:pPr>
         <w:pStyle w:val="Bibliography"/>
@@ -8026,8 +7837,8 @@
         </w:r>
       </w:hyperlink>
     </w:p>
-    <w:bookmarkEnd w:id="54"/>
-    <w:bookmarkStart w:id="56" w:name="ref-gatti2026avalanche"/>
+    <w:bookmarkEnd w:id="53"/>
+    <w:bookmarkStart w:id="55" w:name="ref-gatti2026avalanche"/>
     <w:p>
       <w:pPr>
         <w:pStyle w:val="Bibliography"/>
@@ -8106,7 +7917,7 @@
         </w:rPr>
         <w:t xml:space="preserve"> </w:t>
       </w:r>
-      <w:hyperlink r:id="rId55">
+      <w:hyperlink r:id="rId54">
         <w:r>
           <w:rPr>
             <w:rStyle w:val="Hyperlink"/>
@@ -8115,8 +7926,8 @@
         </w:r>
       </w:hyperlink>
     </w:p>
-    <w:bookmarkEnd w:id="56"/>
-    <w:bookmarkStart w:id="58" w:name="ref-gelato2026promptable"/>
+    <w:bookmarkEnd w:id="55"/>
+    <w:bookmarkStart w:id="57" w:name="ref-gelato2026promptable"/>
     <w:p>
       <w:pPr>
         <w:pStyle w:val="Bibliography"/>
@@ -8210,7 +8021,7 @@
         </w:rPr>
         <w:t xml:space="preserve"> </w:t>
       </w:r>
-      <w:hyperlink r:id="rId57">
+      <w:hyperlink r:id="rId56">
         <w:r>
           <w:rPr>
             <w:rStyle w:val="Hyperlink"/>
@@ -8219,8 +8030,8 @@
         </w:r>
       </w:hyperlink>
     </w:p>
-    <w:bookmarkEnd w:id="58"/>
-    <w:bookmarkStart w:id="60" w:name="ref-nguyen2025landslide"/>
+    <w:bookmarkEnd w:id="57"/>
+    <w:bookmarkStart w:id="59" w:name="ref-nguyen2025landslide"/>
     <w:p>
       <w:pPr>
         <w:pStyle w:val="Bibliography"/>
@@ -8263,7 +8074,7 @@
         </w:rPr>
         <w:t xml:space="preserve"> </w:t>
       </w:r>
-      <w:hyperlink r:id="rId59">
+      <w:hyperlink r:id="rId58">
         <w:r>
           <w:rPr>
             <w:rStyle w:val="Hyperlink"/>
@@ -8272,8 +8083,8 @@
         </w:r>
       </w:hyperlink>
     </w:p>
-    <w:bookmarkEnd w:id="60"/>
-    <w:bookmarkStart w:id="62" w:name="ref-openstreetmap2026"/>
+    <w:bookmarkEnd w:id="59"/>
+    <w:bookmarkStart w:id="61" w:name="ref-openstreetmap2026"/>
     <w:p>
       <w:pPr>
         <w:pStyle w:val="Bibliography"/>
@@ -8316,7 +8127,7 @@
         </w:rPr>
         <w:t xml:space="preserve"> </w:t>
       </w:r>
-      <w:hyperlink r:id="rId61">
+      <w:hyperlink r:id="rId60">
         <w:r>
           <w:rPr>
             <w:rStyle w:val="Hyperlink"/>
@@ -8332,8 +8143,8 @@
         <w:t xml:space="preserve">.</w:t>
       </w:r>
     </w:p>
-    <w:bookmarkEnd w:id="62"/>
-    <w:bookmarkStart w:id="64" w:name="ref-tompkin2021backscatter"/>
+    <w:bookmarkEnd w:id="61"/>
+    <w:bookmarkStart w:id="63" w:name="ref-tompkin2021backscatter"/>
     <w:p>
       <w:pPr>
         <w:pStyle w:val="Bibliography"/>
@@ -8399,7 +8210,7 @@
         </w:rPr>
         <w:t xml:space="preserve"> </w:t>
       </w:r>
-      <w:hyperlink r:id="rId63">
+      <w:hyperlink r:id="rId62">
         <w:r>
           <w:rPr>
             <w:rStyle w:val="Hyperlink"/>
@@ -8408,8 +8219,8 @@
         </w:r>
       </w:hyperlink>
     </w:p>
-    <w:bookmarkEnd w:id="64"/>
-    <w:bookmarkStart w:id="66" w:name="ref-wang2025change"/>
+    <w:bookmarkEnd w:id="63"/>
+    <w:bookmarkStart w:id="65" w:name="ref-wang2025change"/>
     <w:p>
       <w:pPr>
         <w:pStyle w:val="Bibliography"/>
@@ -8503,7 +8314,7 @@
         </w:rPr>
         <w:t xml:space="preserve"> </w:t>
       </w:r>
-      <w:hyperlink r:id="rId65">
+      <w:hyperlink r:id="rId64">
         <w:r>
           <w:rPr>
             <w:rStyle w:val="Hyperlink"/>
@@ -8512,8 +8323,8 @@
         </w:r>
       </w:hyperlink>
     </w:p>
-    <w:bookmarkEnd w:id="66"/>
-    <w:bookmarkStart w:id="68" w:name="ref-zhang2018road"/>
+    <w:bookmarkEnd w:id="65"/>
+    <w:bookmarkStart w:id="67" w:name="ref-zhang2018road"/>
     <w:p>
       <w:pPr>
         <w:pStyle w:val="Bibliography"/>
@@ -8600,7 +8411,7 @@
         </w:rPr>
         <w:t xml:space="preserve"> </w:t>
       </w:r>
-      <w:hyperlink r:id="rId67">
+      <w:hyperlink r:id="rId66">
         <w:r>
           <w:rPr>
             <w:rStyle w:val="Hyperlink"/>
@@ -8609,9 +8420,9 @@
         </w:r>
       </w:hyperlink>
     </w:p>
+    <w:bookmarkEnd w:id="67"/>
     <w:bookmarkEnd w:id="68"/>
     <w:bookmarkEnd w:id="69"/>
-    <w:bookmarkEnd w:id="70"/>
     <w:sectPr>
       <w:footerReference w:type="default" r:id="rId9"/>
       <w:footnotePr>
@@ -8619,6 +8430,7 @@
       </w:footnotePr>
       <w:pgSz w:w="11906" w:h="16838"/>
       <w:pgMar w:top="1134" w:bottom="1134" w:left="1134" w:right="1134"/>
+      <w:lnNumType w:countBy="1" w:start="1" w:restart="continuous"/>
     </w:sectPr>
   </w:body>
 </w:document>

</xml_diff>